<commit_message>
docs(entregas): relatório da auditoria 2026-06-10 + ajustes no artigo ENEGEP
Co-Authored-By: Claude Fable 5 <noreply@anthropic.com>
</commit_message>
<xml_diff>
--- a/Entregas/Sprint 0/PSP2_Artigo_ENEGEP_Introducao.docx
+++ b/Entregas/Sprint 0/PSP2_Artigo_ENEGEP_Introducao.docx
@@ -1079,7 +1079,7 @@
           <w:sz w:val="24"/>
           <w:szCs w:val="24"/>
         </w:rPr>
-        <w:t xml:space="preserve">A população-alvo do estudo são estudantes de graduação da Universidade de Brasília (UnB) que utilizam regularmente plataformas de IA generativa para fins acadêmicos. A amostra, definida por conveniência, é composta por dez participantes distribuídos em diferentes cursos, com predomínio inicial em Engenharia de Produção. Trata-se de amostra exploratória, suficiente para validar a viabilidade do artefato, sem pretensão de generalização estatística (Dresch; Lacerda; Antunes Jr., 2015).</w:t>
+        <w:t xml:space="preserve">A população-alvo do estudo são estudantes de graduação da Universidade de Brasília (UnB) que utilizam regularmente plataformas de IA generativa para fins acadêmicos. A amostra prevista para a avaliação, definida por conveniência, é de dez participantes distribuídos em diferentes cursos, com predomínio inicial em Engenharia de Produção. Trata-se de amostra exploratória, destinada a validar a viabilidade do artefato, sem pretensão de generalização estatística (Dresch; Lacerda; Antunes Jr., 2015).</w:t>
       </w:r>
     </w:p>
     <w:p>
@@ -1123,7 +1123,7 @@
           <w:sz w:val="24"/>
           <w:szCs w:val="24"/>
         </w:rPr>
-        <w:t xml:space="preserve">O estudo ocorre no contexto da disciplina Projeto de Sistemas de Produção 2 (PSP2), ofertada no sexto semestre do curso de Engenharia de Produção da UnB, no período letivo 2026.1. Os participantes da avaliação são estudantes voluntários da UnB recrutados via divulgação em redes sociais acadêmicas, mediante assinatura de Termo de Consentimento Livre e Esclarecido (TCLE) e garantia de anonimização das contribuições. Documentos enviados durante os testes não são compartilhados além do pipeline de processamento; o isolamento é garantido por políticas de segurança em nível de linha (Row Level Security) aplicadas no banco de dados.</w:t>
+        <w:t xml:space="preserve">O estudo ocorre no contexto da disciplina Projeto de Sistemas de Produção 2 (PSP2), ofertada no sexto semestre do curso de Engenharia de Produção da UnB, no período letivo 2026.1. Os participantes da avaliação serão estudantes voluntários da UnB, recrutados via divulgação em redes sociais acadêmicas, mediante assinatura de Termo de Consentimento Livre e Esclarecido (TCLE) e garantia de anonimização das contribuições. Documentos enviados durante os testes não são compartilhados além do pipeline de processamento; o isolamento é garantido por políticas de segurança em nível de linha (Row Level Security) aplicadas no banco de dados.</w:t>
       </w:r>
     </w:p>
     <w:p>
@@ -1167,7 +1167,7 @@
           <w:sz w:val="24"/>
           <w:szCs w:val="24"/>
         </w:rPr>
-        <w:t xml:space="preserve">O projeto está estruturado em quatro sprints de aproximadamente três semanas cada, mapeadas às seis atividades da Design Science Research Methodology (DSRM) proposta por Peffers et al. (2007): (i) identificação do problema; (ii) definição dos objetivos do artefato; (iii) projeto e desenvolvimento; (iv) demonstração; (v) avaliação; e (vi) comunicação. As atividades (i) e (ii) correspondem ao diagnóstico apresentado na Seção 1 e à definição do backlog do produto. As atividades (iii) e (iv) abrangem o desenvolvimento do protótipo, com testes em 50 documentos-teste. A atividade (v) é realizada com dez estudantes da UnB. A atividade (vi) corresponde ao presente artigo, à apresentação final e ao pacote de entrega.</w:t>
+        <w:t xml:space="preserve">O projeto está estruturado em quatro sprints de aproximadamente três semanas cada, mapeadas às seis atividades da Design Science Research Methodology (DSRM) proposta por Peffers et al. (2007): (i) identificação do problema; (ii) definição dos objetivos do artefato; (iii) projeto e desenvolvimento; (iv) demonstração; (v) avaliação; e (vi) comunicação. As atividades (i) e (ii) correspondem ao diagnóstico apresentado na Seção 1 e à definição do backlog do produto. As atividades (iii) e (iv) abrangem o desenvolvimento e a demonstração do protótipo. A atividade (v), de avaliação, prevê a validação técnica do pipeline em documentos-teste e a avaliação com dez estudantes da UnB; sua execução, contudo, ficou condicionada à disponibilização pública do sistema, não concluída neste ciclo (ver Seção 5). A atividade (vi) corresponde ao presente artigo, à apresentação final e ao pacote de entrega.</w:t>
       </w:r>
     </w:p>
     <w:p>
@@ -1211,27 +1211,27 @@
           <w:sz w:val="24"/>
           <w:szCs w:val="24"/>
         </w:rPr>
-        <w:t xml:space="preserve">A coleta de dados ocorre em duas frentes complementares. A primeira é a avaliação técnica do artefato (DSRM, atividade 5, parte 1), realizada com 50 documentos-teste distribuídos em cinco formatos (PDF, DOCX, PPTX, imagens e Markdown), submetidos ao pipeline em ambiente controlado. As métricas registradas são taxa de classificação correta, taxa de aprovação na validação semântica em quatro camadas (estrutural, quantitativa, semântica e LLM-as-judge), custo médio por documento (em dólar) e latência observada nos percentis 50 e 95.</w:t>
-      </w:r>
-    </w:p>
-    <w:p>
-      <w:pPr>
-        <w:widowControl/>
-        <w:spacing w:line="360" w:lineRule="auto"/>
-        <w:jc w:val="both"/>
-        <w:rPr>
-          <w:color w:val="333333"/>
-          <w:sz w:val="24"/>
-          <w:szCs w:val="24"/>
-        </w:rPr>
-      </w:pPr>
-      <w:r>
-        <w:rPr>
-          <w:color w:val="333333"/>
-          <w:sz w:val="24"/>
-          <w:szCs w:val="24"/>
-        </w:rPr>
-        <w:t xml:space="preserve">A segunda frente é a avaliação com usuários (DSRM, atividade 5, parte 2), conduzida em sessões individuais de aproximadamente 60 minutos, realizadas remotamente. Cada participante executa o seguinte roteiro: cadastro no sistema; onboarding (preenchimento de curso, semestre, matérias e horários); upload de três documentos próprios; revisão dos arquivos sintetizados; e utilização do system prompt gerado em uma plataforma de IA de sua escolha. Ao final da sessão, são aplicados os instrumentos descritos a seguir:</w:t>
+        <w:t xml:space="preserve">A coleta de dados ocorre em duas frentes complementares. A primeira é a avaliação técnica do artefato (DSRM, atividade 5, parte 1), prevista para 50 documentos-teste distribuídos em cinco formatos (PDF, DOCX, PPTX, imagens e Markdown), a serem submetidos ao pipeline em ambiente controlado. As métricas a registrar são taxa de classificação correta, taxa de aprovação na validação semântica em quatro camadas (estrutural, quantitativa, semântica e LLM-as-judge), custo médio por documento (em dólar) e latência observada nos percentis 50 e 95.</w:t>
+      </w:r>
+    </w:p>
+    <w:p>
+      <w:pPr>
+        <w:widowControl/>
+        <w:spacing w:line="360" w:lineRule="auto"/>
+        <w:jc w:val="both"/>
+        <w:rPr>
+          <w:color w:val="333333"/>
+          <w:sz w:val="24"/>
+          <w:szCs w:val="24"/>
+        </w:rPr>
+      </w:pPr>
+      <w:r>
+        <w:rPr>
+          <w:color w:val="333333"/>
+          <w:sz w:val="24"/>
+          <w:szCs w:val="24"/>
+        </w:rPr>
+        <w:t xml:space="preserve">A segunda frente é a avaliação com usuários (DSRM, atividade 5, parte 2), prevista para sessões individuais de aproximadamente 60 minutos, realizadas remotamente. Cada participante executaria o seguinte roteiro: cadastro no sistema; onboarding (preenchimento de curso, semestre, matérias e horários); upload de três documentos próprios; revisão dos arquivos sintetizados; e utilização do system prompt gerado em uma plataforma de IA de sua escolha. Ao final da sessão, seriam aplicados os instrumentos descritos a seguir:</w:t>
       </w:r>
     </w:p>
     <w:p>
@@ -1763,7 +1763,7 @@
           <w:sz w:val="24"/>
           <w:szCs w:val="24"/>
         </w:rPr>
-        <w:t xml:space="preserve">Esta seção apresenta os resultados da avaliação do artefato em duas frentes — validação técnica do pipeline com 50 documentos-teste e avaliação com 10 estudantes da UnB — e discute os achados à luz da literatura revisada.</w:t>
+        <w:t xml:space="preserve">Esta seção apresenta os resultados deste ciclo do projeto. Em coerência com o método Design Science Research, o principal resultado é o próprio artefato construído e demonstrado (5.1); na sequência, descreve-se o protocolo de avaliação técnica e com usuários, cuja execução permaneceu pendente ao fim do ciclo (5.2), e discutem-se as contribuições à luz da literatura revisada (5.3).</w:t>
       </w:r>
     </w:p>
     <w:p>
@@ -1787,27 +1787,27 @@
           <w:sz w:val="24"/>
           <w:szCs w:val="24"/>
         </w:rPr>
-        <w:t xml:space="preserve">5.1. Resultados da validação técnica</w:t>
-      </w:r>
-    </w:p>
-    <w:p>
-      <w:pPr>
-        <w:widowControl/>
-        <w:spacing w:line="360" w:lineRule="auto"/>
-        <w:jc w:val="both"/>
-        <w:rPr>
-          <w:color w:val="333333"/>
-          <w:sz w:val="24"/>
-          <w:szCs w:val="24"/>
-        </w:rPr>
-      </w:pPr>
-      <w:r>
-        <w:rPr>
-          <w:color w:val="333333"/>
-          <w:sz w:val="24"/>
-          <w:szCs w:val="24"/>
-        </w:rPr>
-        <w:t xml:space="preserve">A validação técnica foi conduzida em ambiente controlado, com 50 documentos selecionados a partir da coleção pessoal do gerente do projeto, distribuídos uniformemente entre os cinco formatos suportados (dez documentos por formato). A Tabela 1 sintetiza os resultados consolidados por formato e ao final apresenta as médias globais.</w:t>
+        <w:t xml:space="preserve">5.1. Artefato desenvolvido e demonstração funcional</w:t>
+      </w:r>
+    </w:p>
+    <w:p>
+      <w:pPr>
+        <w:widowControl/>
+        <w:spacing w:line="360" w:lineRule="auto"/>
+        <w:jc w:val="both"/>
+        <w:rPr>
+          <w:color w:val="333333"/>
+          <w:sz w:val="24"/>
+          <w:szCs w:val="24"/>
+        </w:rPr>
+      </w:pPr>
+      <w:r>
+        <w:rPr>
+          <w:color w:val="333333"/>
+          <w:sz w:val="24"/>
+          <w:szCs w:val="24"/>
+        </w:rPr>
+        <w:t xml:space="preserve">O principal resultado deste ciclo é o próprio artefato. Foi desenvolvido um protótipo funcional que percorre, de ponta a ponta, o fluxo de ingestão, classificação, síntese, compressão e exportação de documentos acadêmicos, conforme descrito na Seção 4. Em ambiente de desenvolvimento, o sistema foi demonstrado processando documentos nos cinco formatos suportados e gerando o conjunto portátil de saídas que caracteriza a proposta — Markdown sintetizado, organizado em pastas, e system prompt personalizado. A Tabela 1 sintetiza os componentes implementados e seu estado.</w:t>
       </w:r>
     </w:p>
     <w:p>
@@ -1826,7 +1826,7 @@
           <w:sz w:val="20"/>
           <w:szCs w:val="20"/>
         </w:rPr>
-        <w:t xml:space="preserve">Tabela 1 – Resultados da validação técnica por formato</w:t>
+        <w:t xml:space="preserve">Tabela 1 – Componentes do artefato e estado de implementação</w:t>
       </w:r>
     </w:p>
     <w:tbl>
@@ -1837,17 +1837,14 @@
         <w:tblLook w:val="04A0"/>
       </w:tblPr>
       <w:tblGrid>
-        <w:gridCol w:w="1400"/>
-        <w:gridCol w:w="1900"/>
-        <w:gridCol w:w="1900"/>
-        <w:gridCol w:w="1300"/>
-        <w:gridCol w:w="1250"/>
-        <w:gridCol w:w="1250"/>
+        <w:gridCol w:w="2700"/>
+        <w:gridCol w:w="4800"/>
+        <w:gridCol w:w="1500"/>
       </w:tblGrid>
       <w:tr>
         <w:tc>
           <w:tcPr>
-            <w:tcW w:w="1400" w:type="dxa"/>
+            <w:tcW w:w="2700" w:type="dxa"/>
             <w:tcBorders>
               <w:top w:val="single" w:sz="4" w:color="333333"/>
               <w:start w:val="single" w:sz="4" w:color="333333"/>
@@ -1882,13 +1879,13 @@
                 <w:sz w:val="20"/>
                 <w:szCs w:val="20"/>
               </w:rPr>
-              <w:t xml:space="preserve">Formato</w:t>
+              <w:t xml:space="preserve">Componente</w:t>
             </w:r>
           </w:p>
         </w:tc>
         <w:tc>
           <w:tcPr>
-            <w:tcW w:w="1900" w:type="dxa"/>
+            <w:tcW w:w="4800" w:type="dxa"/>
             <w:tcBorders>
               <w:top w:val="single" w:sz="4" w:color="333333"/>
               <w:start w:val="single" w:sz="4" w:color="333333"/>
@@ -1923,13 +1920,13 @@
                 <w:sz w:val="20"/>
                 <w:szCs w:val="20"/>
               </w:rPr>
-              <w:t xml:space="preserve">Classificação correta</w:t>
+              <w:t xml:space="preserve">Função no pipeline</w:t>
             </w:r>
           </w:p>
         </w:tc>
         <w:tc>
           <w:tcPr>
-            <w:tcW w:w="1900" w:type="dxa"/>
+            <w:tcW w:w="1500" w:type="dxa"/>
             <w:tcBorders>
               <w:top w:val="single" w:sz="4" w:color="333333"/>
               <w:start w:val="single" w:sz="4" w:color="333333"/>
@@ -1964,20 +1961,21 @@
                 <w:sz w:val="20"/>
                 <w:szCs w:val="20"/>
               </w:rPr>
-              <w:t xml:space="preserve">Aprovação na validação</w:t>
+              <w:t xml:space="preserve">Situação</w:t>
             </w:r>
           </w:p>
         </w:tc>
+      </w:tr>
+      <w:tr>
         <w:tc>
           <w:tcPr>
-            <w:tcW w:w="1300" w:type="dxa"/>
+            <w:tcW w:w="2700" w:type="dxa"/>
             <w:tcBorders>
               <w:top w:val="single" w:sz="4" w:color="333333"/>
               <w:start w:val="single" w:sz="4" w:color="333333"/>
               <w:bottom w:val="single" w:sz="4" w:color="333333"/>
               <w:end w:val="single" w:sz="4" w:color="333333"/>
             </w:tcBorders>
-            <w:shd w:val="clear" w:color="auto" w:fill="E6E6E6"/>
             <w:tcMar>
               <w:top w:w="60" w:type="dxa"/>
               <w:start w:w="100" w:type="dxa"/>
@@ -1988,10 +1986,8 @@
           <w:p>
             <w:pPr>
               <w:spacing w:line="360" w:lineRule="auto"/>
-              <w:jc w:val="center"/>
-              <w:rPr>
-                <w:b/>
-                <w:bCs/>
+              <w:jc w:val="start"/>
+              <w:rPr>
                 <w:color w:val="333333"/>
                 <w:sz w:val="20"/>
                 <w:szCs w:val="20"/>
@@ -1999,26 +1995,23 @@
             </w:pPr>
             <w:r>
               <w:rPr>
-                <w:b/>
-                <w:bCs/>
-                <w:color w:val="333333"/>
-                <w:sz w:val="20"/>
-                <w:szCs w:val="20"/>
-              </w:rPr>
-              <w:t xml:space="preserve">Custo médio (USD)</w:t>
+                <w:color w:val="333333"/>
+                <w:sz w:val="20"/>
+                <w:szCs w:val="20"/>
+              </w:rPr>
+              <w:t xml:space="preserve">Parsing multiformato</w:t>
             </w:r>
           </w:p>
         </w:tc>
         <w:tc>
           <w:tcPr>
-            <w:tcW w:w="1250" w:type="dxa"/>
+            <w:tcW w:w="4800" w:type="dxa"/>
             <w:tcBorders>
               <w:top w:val="single" w:sz="4" w:color="333333"/>
               <w:start w:val="single" w:sz="4" w:color="333333"/>
               <w:bottom w:val="single" w:sz="4" w:color="333333"/>
               <w:end w:val="single" w:sz="4" w:color="333333"/>
             </w:tcBorders>
-            <w:shd w:val="clear" w:color="auto" w:fill="E6E6E6"/>
             <w:tcMar>
               <w:top w:w="60" w:type="dxa"/>
               <w:start w:w="100" w:type="dxa"/>
@@ -2029,10 +2022,8 @@
           <w:p>
             <w:pPr>
               <w:spacing w:line="360" w:lineRule="auto"/>
-              <w:jc w:val="center"/>
-              <w:rPr>
-                <w:b/>
-                <w:bCs/>
+              <w:jc w:val="start"/>
+              <w:rPr>
                 <w:color w:val="333333"/>
                 <w:sz w:val="20"/>
                 <w:szCs w:val="20"/>
@@ -2040,62 +2031,17 @@
             </w:pPr>
             <w:r>
               <w:rPr>
-                <w:b/>
-                <w:bCs/>
-                <w:color w:val="333333"/>
-                <w:sz w:val="20"/>
-                <w:szCs w:val="20"/>
-              </w:rPr>
-              <w:t xml:space="preserve">Latência p50 (s)</w:t>
+                <w:color w:val="333333"/>
+                <w:sz w:val="20"/>
+                <w:szCs w:val="20"/>
+              </w:rPr>
+              <w:t xml:space="preserve">Extração de texto de PDF, DOCX, PPTX, Markdown e imagens</w:t>
             </w:r>
           </w:p>
         </w:tc>
         <w:tc>
           <w:tcPr>
-            <w:tcW w:w="1250" w:type="dxa"/>
-            <w:tcBorders>
-              <w:top w:val="single" w:sz="4" w:color="333333"/>
-              <w:start w:val="single" w:sz="4" w:color="333333"/>
-              <w:bottom w:val="single" w:sz="4" w:color="333333"/>
-              <w:end w:val="single" w:sz="4" w:color="333333"/>
-            </w:tcBorders>
-            <w:shd w:val="clear" w:color="auto" w:fill="E6E6E6"/>
-            <w:tcMar>
-              <w:top w:w="60" w:type="dxa"/>
-              <w:start w:w="100" w:type="dxa"/>
-              <w:bottom w:w="60" w:type="dxa"/>
-              <w:end w:w="100" w:type="dxa"/>
-            </w:tcMar>
-          </w:tcPr>
-          <w:p>
-            <w:pPr>
-              <w:spacing w:line="360" w:lineRule="auto"/>
-              <w:jc w:val="center"/>
-              <w:rPr>
-                <w:b/>
-                <w:bCs/>
-                <w:color w:val="333333"/>
-                <w:sz w:val="20"/>
-                <w:szCs w:val="20"/>
-              </w:rPr>
-            </w:pPr>
-            <w:r>
-              <w:rPr>
-                <w:b/>
-                <w:bCs/>
-                <w:color w:val="333333"/>
-                <w:sz w:val="20"/>
-                <w:szCs w:val="20"/>
-              </w:rPr>
-              <w:t xml:space="preserve">Latência p95 (s)</w:t>
-            </w:r>
-          </w:p>
-        </w:tc>
-      </w:tr>
-      <w:tr>
-        <w:tc>
-          <w:tcPr>
-            <w:tcW w:w="1400" w:type="dxa"/>
+            <w:tcW w:w="1500" w:type="dxa"/>
             <w:tcBorders>
               <w:top w:val="single" w:sz="4" w:color="333333"/>
               <w:start w:val="single" w:sz="4" w:color="333333"/>
@@ -2125,13 +2071,87 @@
                 <w:sz w:val="20"/>
                 <w:szCs w:val="20"/>
               </w:rPr>
-              <w:t xml:space="preserve">PDF</w:t>
+              <w:t xml:space="preserve">Implementado</w:t>
+            </w:r>
+          </w:p>
+        </w:tc>
+      </w:tr>
+      <w:tr>
+        <w:tc>
+          <w:tcPr>
+            <w:tcW w:w="2700" w:type="dxa"/>
+            <w:tcBorders>
+              <w:top w:val="single" w:sz="4" w:color="333333"/>
+              <w:start w:val="single" w:sz="4" w:color="333333"/>
+              <w:bottom w:val="single" w:sz="4" w:color="333333"/>
+              <w:end w:val="single" w:sz="4" w:color="333333"/>
+            </w:tcBorders>
+            <w:tcMar>
+              <w:top w:w="60" w:type="dxa"/>
+              <w:start w:w="100" w:type="dxa"/>
+              <w:bottom w:w="60" w:type="dxa"/>
+              <w:end w:w="100" w:type="dxa"/>
+            </w:tcMar>
+          </w:tcPr>
+          <w:p>
+            <w:pPr>
+              <w:spacing w:line="360" w:lineRule="auto"/>
+              <w:jc w:val="start"/>
+              <w:rPr>
+                <w:color w:val="333333"/>
+                <w:sz w:val="20"/>
+                <w:szCs w:val="20"/>
+              </w:rPr>
+            </w:pPr>
+            <w:r>
+              <w:rPr>
+                <w:color w:val="333333"/>
+                <w:sz w:val="20"/>
+                <w:szCs w:val="20"/>
+              </w:rPr>
+              <w:t xml:space="preserve">Classificação por LLM</w:t>
             </w:r>
           </w:p>
         </w:tc>
         <w:tc>
           <w:tcPr>
-            <w:tcW w:w="1900" w:type="dxa"/>
+            <w:tcW w:w="4800" w:type="dxa"/>
+            <w:tcBorders>
+              <w:top w:val="single" w:sz="4" w:color="333333"/>
+              <w:start w:val="single" w:sz="4" w:color="333333"/>
+              <w:bottom w:val="single" w:sz="4" w:color="333333"/>
+              <w:end w:val="single" w:sz="4" w:color="333333"/>
+            </w:tcBorders>
+            <w:tcMar>
+              <w:top w:w="60" w:type="dxa"/>
+              <w:start w:w="100" w:type="dxa"/>
+              <w:bottom w:w="60" w:type="dxa"/>
+              <w:end w:w="100" w:type="dxa"/>
+            </w:tcMar>
+          </w:tcPr>
+          <w:p>
+            <w:pPr>
+              <w:spacing w:line="360" w:lineRule="auto"/>
+              <w:jc w:val="start"/>
+              <w:rPr>
+                <w:color w:val="333333"/>
+                <w:sz w:val="20"/>
+                <w:szCs w:val="20"/>
+              </w:rPr>
+            </w:pPr>
+            <w:r>
+              <w:rPr>
+                <w:color w:val="333333"/>
+                <w:sz w:val="20"/>
+                <w:szCs w:val="20"/>
+              </w:rPr>
+              <w:t xml:space="preserve">Identificação de matéria, tipo, data e título, com índice de confiança</w:t>
+            </w:r>
+          </w:p>
+        </w:tc>
+        <w:tc>
+          <w:tcPr>
+            <w:tcW w:w="1500" w:type="dxa"/>
             <w:tcBorders>
               <w:top w:val="single" w:sz="4" w:color="333333"/>
               <w:start w:val="single" w:sz="4" w:color="333333"/>
@@ -2161,13 +2181,87 @@
                 <w:sz w:val="20"/>
                 <w:szCs w:val="20"/>
               </w:rPr>
-              <w:t xml:space="preserve">90%</w:t>
+              <w:t xml:space="preserve">Implementado</w:t>
+            </w:r>
+          </w:p>
+        </w:tc>
+      </w:tr>
+      <w:tr>
+        <w:tc>
+          <w:tcPr>
+            <w:tcW w:w="2700" w:type="dxa"/>
+            <w:tcBorders>
+              <w:top w:val="single" w:sz="4" w:color="333333"/>
+              <w:start w:val="single" w:sz="4" w:color="333333"/>
+              <w:bottom w:val="single" w:sz="4" w:color="333333"/>
+              <w:end w:val="single" w:sz="4" w:color="333333"/>
+            </w:tcBorders>
+            <w:tcMar>
+              <w:top w:w="60" w:type="dxa"/>
+              <w:start w:w="100" w:type="dxa"/>
+              <w:bottom w:w="60" w:type="dxa"/>
+              <w:end w:w="100" w:type="dxa"/>
+            </w:tcMar>
+          </w:tcPr>
+          <w:p>
+            <w:pPr>
+              <w:spacing w:line="360" w:lineRule="auto"/>
+              <w:jc w:val="start"/>
+              <w:rPr>
+                <w:color w:val="333333"/>
+                <w:sz w:val="20"/>
+                <w:szCs w:val="20"/>
+              </w:rPr>
+            </w:pPr>
+            <w:r>
+              <w:rPr>
+                <w:color w:val="333333"/>
+                <w:sz w:val="20"/>
+                <w:szCs w:val="20"/>
+              </w:rPr>
+              <w:t xml:space="preserve">Síntese</w:t>
             </w:r>
           </w:p>
         </w:tc>
         <w:tc>
           <w:tcPr>
-            <w:tcW w:w="1900" w:type="dxa"/>
+            <w:tcW w:w="4800" w:type="dxa"/>
+            <w:tcBorders>
+              <w:top w:val="single" w:sz="4" w:color="333333"/>
+              <w:start w:val="single" w:sz="4" w:color="333333"/>
+              <w:bottom w:val="single" w:sz="4" w:color="333333"/>
+              <w:end w:val="single" w:sz="4" w:color="333333"/>
+            </w:tcBorders>
+            <w:tcMar>
+              <w:top w:w="60" w:type="dxa"/>
+              <w:start w:w="100" w:type="dxa"/>
+              <w:bottom w:w="60" w:type="dxa"/>
+              <w:end w:w="100" w:type="dxa"/>
+            </w:tcMar>
+          </w:tcPr>
+          <w:p>
+            <w:pPr>
+              <w:spacing w:line="360" w:lineRule="auto"/>
+              <w:jc w:val="start"/>
+              <w:rPr>
+                <w:color w:val="333333"/>
+                <w:sz w:val="20"/>
+                <w:szCs w:val="20"/>
+              </w:rPr>
+            </w:pPr>
+            <w:r>
+              <w:rPr>
+                <w:color w:val="333333"/>
+                <w:sz w:val="20"/>
+                <w:szCs w:val="20"/>
+              </w:rPr>
+              <w:t xml:space="preserve">Geração de Markdown estruturado, com fórmulas e tabelas preservadas</w:t>
+            </w:r>
+          </w:p>
+        </w:tc>
+        <w:tc>
+          <w:tcPr>
+            <w:tcW w:w="1500" w:type="dxa"/>
             <w:tcBorders>
               <w:top w:val="single" w:sz="4" w:color="333333"/>
               <w:start w:val="single" w:sz="4" w:color="333333"/>
@@ -2197,13 +2291,87 @@
                 <w:sz w:val="20"/>
                 <w:szCs w:val="20"/>
               </w:rPr>
-              <w:t xml:space="preserve">85%</w:t>
+              <w:t xml:space="preserve">Implementado</w:t>
+            </w:r>
+          </w:p>
+        </w:tc>
+      </w:tr>
+      <w:tr>
+        <w:tc>
+          <w:tcPr>
+            <w:tcW w:w="2700" w:type="dxa"/>
+            <w:tcBorders>
+              <w:top w:val="single" w:sz="4" w:color="333333"/>
+              <w:start w:val="single" w:sz="4" w:color="333333"/>
+              <w:bottom w:val="single" w:sz="4" w:color="333333"/>
+              <w:end w:val="single" w:sz="4" w:color="333333"/>
+            </w:tcBorders>
+            <w:tcMar>
+              <w:top w:w="60" w:type="dxa"/>
+              <w:start w:w="100" w:type="dxa"/>
+              <w:bottom w:w="60" w:type="dxa"/>
+              <w:end w:w="100" w:type="dxa"/>
+            </w:tcMar>
+          </w:tcPr>
+          <w:p>
+            <w:pPr>
+              <w:spacing w:line="360" w:lineRule="auto"/>
+              <w:jc w:val="start"/>
+              <w:rPr>
+                <w:color w:val="333333"/>
+                <w:sz w:val="20"/>
+                <w:szCs w:val="20"/>
+              </w:rPr>
+            </w:pPr>
+            <w:r>
+              <w:rPr>
+                <w:color w:val="333333"/>
+                <w:sz w:val="20"/>
+                <w:szCs w:val="20"/>
+              </w:rPr>
+              <w:t xml:space="preserve">Compressão</w:t>
             </w:r>
           </w:p>
         </w:tc>
         <w:tc>
           <w:tcPr>
-            <w:tcW w:w="1300" w:type="dxa"/>
+            <w:tcW w:w="4800" w:type="dxa"/>
+            <w:tcBorders>
+              <w:top w:val="single" w:sz="4" w:color="333333"/>
+              <w:start w:val="single" w:sz="4" w:color="333333"/>
+              <w:bottom w:val="single" w:sz="4" w:color="333333"/>
+              <w:end w:val="single" w:sz="4" w:color="333333"/>
+            </w:tcBorders>
+            <w:tcMar>
+              <w:top w:w="60" w:type="dxa"/>
+              <w:start w:w="100" w:type="dxa"/>
+              <w:bottom w:w="60" w:type="dxa"/>
+              <w:end w:w="100" w:type="dxa"/>
+            </w:tcMar>
+          </w:tcPr>
+          <w:p>
+            <w:pPr>
+              <w:spacing w:line="360" w:lineRule="auto"/>
+              <w:jc w:val="start"/>
+              <w:rPr>
+                <w:color w:val="333333"/>
+                <w:sz w:val="20"/>
+                <w:szCs w:val="20"/>
+              </w:rPr>
+            </w:pPr>
+            <w:r>
+              <w:rPr>
+                <w:color w:val="333333"/>
+                <w:sz w:val="20"/>
+                <w:szCs w:val="20"/>
+              </w:rPr>
+              <w:t xml:space="preserve">Modos compacto e cola, com reduções parametrizadas</w:t>
+            </w:r>
+          </w:p>
+        </w:tc>
+        <w:tc>
+          <w:tcPr>
+            <w:tcW w:w="1500" w:type="dxa"/>
             <w:tcBorders>
               <w:top w:val="single" w:sz="4" w:color="333333"/>
               <w:start w:val="single" w:sz="4" w:color="333333"/>
@@ -2233,13 +2401,87 @@
                 <w:sz w:val="20"/>
                 <w:szCs w:val="20"/>
               </w:rPr>
-              <w:t xml:space="preserve">0,014</w:t>
+              <w:t xml:space="preserve">Implementado</w:t>
+            </w:r>
+          </w:p>
+        </w:tc>
+      </w:tr>
+      <w:tr>
+        <w:tc>
+          <w:tcPr>
+            <w:tcW w:w="2700" w:type="dxa"/>
+            <w:tcBorders>
+              <w:top w:val="single" w:sz="4" w:color="333333"/>
+              <w:start w:val="single" w:sz="4" w:color="333333"/>
+              <w:bottom w:val="single" w:sz="4" w:color="333333"/>
+              <w:end w:val="single" w:sz="4" w:color="333333"/>
+            </w:tcBorders>
+            <w:tcMar>
+              <w:top w:w="60" w:type="dxa"/>
+              <w:start w:w="100" w:type="dxa"/>
+              <w:bottom w:w="60" w:type="dxa"/>
+              <w:end w:w="100" w:type="dxa"/>
+            </w:tcMar>
+          </w:tcPr>
+          <w:p>
+            <w:pPr>
+              <w:spacing w:line="360" w:lineRule="auto"/>
+              <w:jc w:val="start"/>
+              <w:rPr>
+                <w:color w:val="333333"/>
+                <w:sz w:val="20"/>
+                <w:szCs w:val="20"/>
+              </w:rPr>
+            </w:pPr>
+            <w:r>
+              <w:rPr>
+                <w:color w:val="333333"/>
+                <w:sz w:val="20"/>
+                <w:szCs w:val="20"/>
+              </w:rPr>
+              <w:t xml:space="preserve">Validação em quatro camadas</w:t>
             </w:r>
           </w:p>
         </w:tc>
         <w:tc>
           <w:tcPr>
-            <w:tcW w:w="1250" w:type="dxa"/>
+            <w:tcW w:w="4800" w:type="dxa"/>
+            <w:tcBorders>
+              <w:top w:val="single" w:sz="4" w:color="333333"/>
+              <w:start w:val="single" w:sz="4" w:color="333333"/>
+              <w:bottom w:val="single" w:sz="4" w:color="333333"/>
+              <w:end w:val="single" w:sz="4" w:color="333333"/>
+            </w:tcBorders>
+            <w:tcMar>
+              <w:top w:w="60" w:type="dxa"/>
+              <w:start w:w="100" w:type="dxa"/>
+              <w:bottom w:w="60" w:type="dxa"/>
+              <w:end w:w="100" w:type="dxa"/>
+            </w:tcMar>
+          </w:tcPr>
+          <w:p>
+            <w:pPr>
+              <w:spacing w:line="360" w:lineRule="auto"/>
+              <w:jc w:val="start"/>
+              <w:rPr>
+                <w:color w:val="333333"/>
+                <w:sz w:val="20"/>
+                <w:szCs w:val="20"/>
+              </w:rPr>
+            </w:pPr>
+            <w:r>
+              <w:rPr>
+                <w:color w:val="333333"/>
+                <w:sz w:val="20"/>
+                <w:szCs w:val="20"/>
+              </w:rPr>
+              <w:t xml:space="preserve">Verificação estrutural, quantitativa, semântica e LLM-as-judge</w:t>
+            </w:r>
+          </w:p>
+        </w:tc>
+        <w:tc>
+          <w:tcPr>
+            <w:tcW w:w="1500" w:type="dxa"/>
             <w:tcBorders>
               <w:top w:val="single" w:sz="4" w:color="333333"/>
               <w:start w:val="single" w:sz="4" w:color="333333"/>
@@ -2269,13 +2511,87 @@
                 <w:sz w:val="20"/>
                 <w:szCs w:val="20"/>
               </w:rPr>
-              <w:t xml:space="preserve">48</w:t>
+              <w:t xml:space="preserve">Implementado</w:t>
+            </w:r>
+          </w:p>
+        </w:tc>
+      </w:tr>
+      <w:tr>
+        <w:tc>
+          <w:tcPr>
+            <w:tcW w:w="2700" w:type="dxa"/>
+            <w:tcBorders>
+              <w:top w:val="single" w:sz="4" w:color="333333"/>
+              <w:start w:val="single" w:sz="4" w:color="333333"/>
+              <w:bottom w:val="single" w:sz="4" w:color="333333"/>
+              <w:end w:val="single" w:sz="4" w:color="333333"/>
+            </w:tcBorders>
+            <w:tcMar>
+              <w:top w:w="60" w:type="dxa"/>
+              <w:start w:w="100" w:type="dxa"/>
+              <w:bottom w:w="60" w:type="dxa"/>
+              <w:end w:w="100" w:type="dxa"/>
+            </w:tcMar>
+          </w:tcPr>
+          <w:p>
+            <w:pPr>
+              <w:spacing w:line="360" w:lineRule="auto"/>
+              <w:jc w:val="start"/>
+              <w:rPr>
+                <w:color w:val="333333"/>
+                <w:sz w:val="20"/>
+                <w:szCs w:val="20"/>
+              </w:rPr>
+            </w:pPr>
+            <w:r>
+              <w:rPr>
+                <w:color w:val="333333"/>
+                <w:sz w:val="20"/>
+                <w:szCs w:val="20"/>
+              </w:rPr>
+              <w:t xml:space="preserve">Geração de system prompt</w:t>
             </w:r>
           </w:p>
         </w:tc>
         <w:tc>
           <w:tcPr>
-            <w:tcW w:w="1250" w:type="dxa"/>
+            <w:tcW w:w="4800" w:type="dxa"/>
+            <w:tcBorders>
+              <w:top w:val="single" w:sz="4" w:color="333333"/>
+              <w:start w:val="single" w:sz="4" w:color="333333"/>
+              <w:bottom w:val="single" w:sz="4" w:color="333333"/>
+              <w:end w:val="single" w:sz="4" w:color="333333"/>
+            </w:tcBorders>
+            <w:tcMar>
+              <w:top w:w="60" w:type="dxa"/>
+              <w:start w:w="100" w:type="dxa"/>
+              <w:bottom w:w="60" w:type="dxa"/>
+              <w:end w:w="100" w:type="dxa"/>
+            </w:tcMar>
+          </w:tcPr>
+          <w:p>
+            <w:pPr>
+              <w:spacing w:line="360" w:lineRule="auto"/>
+              <w:jc w:val="start"/>
+              <w:rPr>
+                <w:color w:val="333333"/>
+                <w:sz w:val="20"/>
+                <w:szCs w:val="20"/>
+              </w:rPr>
+            </w:pPr>
+            <w:r>
+              <w:rPr>
+                <w:color w:val="333333"/>
+                <w:sz w:val="20"/>
+                <w:szCs w:val="20"/>
+              </w:rPr>
+              <w:t xml:space="preserve">Composição de instruções personalizadas portáteis</w:t>
+            </w:r>
+          </w:p>
+        </w:tc>
+        <w:tc>
+          <w:tcPr>
+            <w:tcW w:w="1500" w:type="dxa"/>
             <w:tcBorders>
               <w:top w:val="single" w:sz="4" w:color="333333"/>
               <w:start w:val="single" w:sz="4" w:color="333333"/>
@@ -2305,7 +2621,7 @@
                 <w:sz w:val="20"/>
                 <w:szCs w:val="20"/>
               </w:rPr>
-              <w:t xml:space="preserve">112</w:t>
+              <w:t xml:space="preserve">Implementado</w:t>
             </w:r>
           </w:p>
         </w:tc>
@@ -2313,7 +2629,79 @@
       <w:tr>
         <w:tc>
           <w:tcPr>
-            <w:tcW w:w="1400" w:type="dxa"/>
+            <w:tcW w:w="2700" w:type="dxa"/>
+            <w:tcBorders>
+              <w:top w:val="single" w:sz="4" w:color="333333"/>
+              <w:start w:val="single" w:sz="4" w:color="333333"/>
+              <w:bottom w:val="single" w:sz="4" w:color="333333"/>
+              <w:end w:val="single" w:sz="4" w:color="333333"/>
+            </w:tcBorders>
+            <w:tcMar>
+              <w:top w:w="60" w:type="dxa"/>
+              <w:start w:w="100" w:type="dxa"/>
+              <w:bottom w:w="60" w:type="dxa"/>
+              <w:end w:w="100" w:type="dxa"/>
+            </w:tcMar>
+          </w:tcPr>
+          <w:p>
+            <w:pPr>
+              <w:spacing w:line="360" w:lineRule="auto"/>
+              <w:jc w:val="start"/>
+              <w:rPr>
+                <w:color w:val="333333"/>
+                <w:sz w:val="20"/>
+                <w:szCs w:val="20"/>
+              </w:rPr>
+            </w:pPr>
+            <w:r>
+              <w:rPr>
+                <w:color w:val="333333"/>
+                <w:sz w:val="20"/>
+                <w:szCs w:val="20"/>
+              </w:rPr>
+              <w:t xml:space="preserve">Biblioteca de prompts</w:t>
+            </w:r>
+          </w:p>
+        </w:tc>
+        <w:tc>
+          <w:tcPr>
+            <w:tcW w:w="4800" w:type="dxa"/>
+            <w:tcBorders>
+              <w:top w:val="single" w:sz="4" w:color="333333"/>
+              <w:start w:val="single" w:sz="4" w:color="333333"/>
+              <w:bottom w:val="single" w:sz="4" w:color="333333"/>
+              <w:end w:val="single" w:sz="4" w:color="333333"/>
+            </w:tcBorders>
+            <w:tcMar>
+              <w:top w:w="60" w:type="dxa"/>
+              <w:start w:w="100" w:type="dxa"/>
+              <w:bottom w:w="60" w:type="dxa"/>
+              <w:end w:w="100" w:type="dxa"/>
+            </w:tcMar>
+          </w:tcPr>
+          <w:p>
+            <w:pPr>
+              <w:spacing w:line="360" w:lineRule="auto"/>
+              <w:jc w:val="start"/>
+              <w:rPr>
+                <w:color w:val="333333"/>
+                <w:sz w:val="20"/>
+                <w:szCs w:val="20"/>
+              </w:rPr>
+            </w:pPr>
+            <w:r>
+              <w:rPr>
+                <w:color w:val="333333"/>
+                <w:sz w:val="20"/>
+                <w:szCs w:val="20"/>
+              </w:rPr>
+              <w:t xml:space="preserve">Oito prompts oficiais para tarefas acadêmicas</w:t>
+            </w:r>
+          </w:p>
+        </w:tc>
+        <w:tc>
+          <w:tcPr>
+            <w:tcW w:w="1500" w:type="dxa"/>
             <w:tcBorders>
               <w:top w:val="single" w:sz="4" w:color="333333"/>
               <w:start w:val="single" w:sz="4" w:color="333333"/>
@@ -2343,13 +2731,87 @@
                 <w:sz w:val="20"/>
                 <w:szCs w:val="20"/>
               </w:rPr>
-              <w:t xml:space="preserve">DOCX</w:t>
+              <w:t xml:space="preserve">Implementado</w:t>
+            </w:r>
+          </w:p>
+        </w:tc>
+      </w:tr>
+      <w:tr>
+        <w:tc>
+          <w:tcPr>
+            <w:tcW w:w="2700" w:type="dxa"/>
+            <w:tcBorders>
+              <w:top w:val="single" w:sz="4" w:color="333333"/>
+              <w:start w:val="single" w:sz="4" w:color="333333"/>
+              <w:bottom w:val="single" w:sz="4" w:color="333333"/>
+              <w:end w:val="single" w:sz="4" w:color="333333"/>
+            </w:tcBorders>
+            <w:tcMar>
+              <w:top w:w="60" w:type="dxa"/>
+              <w:start w:w="100" w:type="dxa"/>
+              <w:bottom w:w="60" w:type="dxa"/>
+              <w:end w:w="100" w:type="dxa"/>
+            </w:tcMar>
+          </w:tcPr>
+          <w:p>
+            <w:pPr>
+              <w:spacing w:line="360" w:lineRule="auto"/>
+              <w:jc w:val="start"/>
+              <w:rPr>
+                <w:color w:val="333333"/>
+                <w:sz w:val="20"/>
+                <w:szCs w:val="20"/>
+              </w:rPr>
+            </w:pPr>
+            <w:r>
+              <w:rPr>
+                <w:color w:val="333333"/>
+                <w:sz w:val="20"/>
+                <w:szCs w:val="20"/>
+              </w:rPr>
+              <w:t xml:space="preserve">Exportação para Google Drive</w:t>
             </w:r>
           </w:p>
         </w:tc>
         <w:tc>
           <w:tcPr>
-            <w:tcW w:w="1900" w:type="dxa"/>
+            <w:tcW w:w="4800" w:type="dxa"/>
+            <w:tcBorders>
+              <w:top w:val="single" w:sz="4" w:color="333333"/>
+              <w:start w:val="single" w:sz="4" w:color="333333"/>
+              <w:bottom w:val="single" w:sz="4" w:color="333333"/>
+              <w:end w:val="single" w:sz="4" w:color="333333"/>
+            </w:tcBorders>
+            <w:tcMar>
+              <w:top w:w="60" w:type="dxa"/>
+              <w:start w:w="100" w:type="dxa"/>
+              <w:bottom w:w="60" w:type="dxa"/>
+              <w:end w:w="100" w:type="dxa"/>
+            </w:tcMar>
+          </w:tcPr>
+          <w:p>
+            <w:pPr>
+              <w:spacing w:line="360" w:lineRule="auto"/>
+              <w:jc w:val="start"/>
+              <w:rPr>
+                <w:color w:val="333333"/>
+                <w:sz w:val="20"/>
+                <w:szCs w:val="20"/>
+              </w:rPr>
+            </w:pPr>
+            <w:r>
+              <w:rPr>
+                <w:color w:val="333333"/>
+                <w:sz w:val="20"/>
+                <w:szCs w:val="20"/>
+              </w:rPr>
+              <w:t xml:space="preserve">Estrutura hierárquica por semestre e matéria (OAuth drive.file)</w:t>
+            </w:r>
+          </w:p>
+        </w:tc>
+        <w:tc>
+          <w:tcPr>
+            <w:tcW w:w="1500" w:type="dxa"/>
             <w:tcBorders>
               <w:top w:val="single" w:sz="4" w:color="333333"/>
               <w:start w:val="single" w:sz="4" w:color="333333"/>
@@ -2379,13 +2841,87 @@
                 <w:sz w:val="20"/>
                 <w:szCs w:val="20"/>
               </w:rPr>
-              <w:t xml:space="preserve">95%</w:t>
+              <w:t xml:space="preserve">Implementado</w:t>
+            </w:r>
+          </w:p>
+        </w:tc>
+      </w:tr>
+      <w:tr>
+        <w:tc>
+          <w:tcPr>
+            <w:tcW w:w="2700" w:type="dxa"/>
+            <w:tcBorders>
+              <w:top w:val="single" w:sz="4" w:color="333333"/>
+              <w:start w:val="single" w:sz="4" w:color="333333"/>
+              <w:bottom w:val="single" w:sz="4" w:color="333333"/>
+              <w:end w:val="single" w:sz="4" w:color="333333"/>
+            </w:tcBorders>
+            <w:tcMar>
+              <w:top w:w="60" w:type="dxa"/>
+              <w:start w:w="100" w:type="dxa"/>
+              <w:bottom w:w="60" w:type="dxa"/>
+              <w:end w:w="100" w:type="dxa"/>
+            </w:tcMar>
+          </w:tcPr>
+          <w:p>
+            <w:pPr>
+              <w:spacing w:line="360" w:lineRule="auto"/>
+              <w:jc w:val="start"/>
+              <w:rPr>
+                <w:color w:val="333333"/>
+                <w:sz w:val="20"/>
+                <w:szCs w:val="20"/>
+              </w:rPr>
+            </w:pPr>
+            <w:r>
+              <w:rPr>
+                <w:color w:val="333333"/>
+                <w:sz w:val="20"/>
+                <w:szCs w:val="20"/>
+              </w:rPr>
+              <w:t xml:space="preserve">Interface web</w:t>
             </w:r>
           </w:p>
         </w:tc>
         <w:tc>
           <w:tcPr>
-            <w:tcW w:w="1900" w:type="dxa"/>
+            <w:tcW w:w="4800" w:type="dxa"/>
+            <w:tcBorders>
+              <w:top w:val="single" w:sz="4" w:color="333333"/>
+              <w:start w:val="single" w:sz="4" w:color="333333"/>
+              <w:bottom w:val="single" w:sz="4" w:color="333333"/>
+              <w:end w:val="single" w:sz="4" w:color="333333"/>
+            </w:tcBorders>
+            <w:tcMar>
+              <w:top w:w="60" w:type="dxa"/>
+              <w:start w:w="100" w:type="dxa"/>
+              <w:bottom w:w="60" w:type="dxa"/>
+              <w:end w:w="100" w:type="dxa"/>
+            </w:tcMar>
+          </w:tcPr>
+          <w:p>
+            <w:pPr>
+              <w:spacing w:line="360" w:lineRule="auto"/>
+              <w:jc w:val="start"/>
+              <w:rPr>
+                <w:color w:val="333333"/>
+                <w:sz w:val="20"/>
+                <w:szCs w:val="20"/>
+              </w:rPr>
+            </w:pPr>
+            <w:r>
+              <w:rPr>
+                <w:color w:val="333333"/>
+                <w:sz w:val="20"/>
+                <w:szCs w:val="20"/>
+              </w:rPr>
+              <w:t xml:space="preserve">Upload, acompanhamento e visualização de saídas</w:t>
+            </w:r>
+          </w:p>
+        </w:tc>
+        <w:tc>
+          <w:tcPr>
+            <w:tcW w:w="1500" w:type="dxa"/>
             <w:tcBorders>
               <w:top w:val="single" w:sz="4" w:color="333333"/>
               <w:start w:val="single" w:sz="4" w:color="333333"/>
@@ -2415,1011 +2951,7 @@
                 <w:sz w:val="20"/>
                 <w:szCs w:val="20"/>
               </w:rPr>
-              <w:t xml:space="preserve">92%</w:t>
-            </w:r>
-          </w:p>
-        </w:tc>
-        <w:tc>
-          <w:tcPr>
-            <w:tcW w:w="1300" w:type="dxa"/>
-            <w:tcBorders>
-              <w:top w:val="single" w:sz="4" w:color="333333"/>
-              <w:start w:val="single" w:sz="4" w:color="333333"/>
-              <w:bottom w:val="single" w:sz="4" w:color="333333"/>
-              <w:end w:val="single" w:sz="4" w:color="333333"/>
-            </w:tcBorders>
-            <w:tcMar>
-              <w:top w:w="60" w:type="dxa"/>
-              <w:start w:w="100" w:type="dxa"/>
-              <w:bottom w:w="60" w:type="dxa"/>
-              <w:end w:w="100" w:type="dxa"/>
-            </w:tcMar>
-          </w:tcPr>
-          <w:p>
-            <w:pPr>
-              <w:spacing w:line="360" w:lineRule="auto"/>
-              <w:jc w:val="center"/>
-              <w:rPr>
-                <w:color w:val="333333"/>
-                <w:sz w:val="20"/>
-                <w:szCs w:val="20"/>
-              </w:rPr>
-            </w:pPr>
-            <w:r>
-              <w:rPr>
-                <w:color w:val="333333"/>
-                <w:sz w:val="20"/>
-                <w:szCs w:val="20"/>
-              </w:rPr>
-              <w:t xml:space="preserve">0,010</w:t>
-            </w:r>
-          </w:p>
-        </w:tc>
-        <w:tc>
-          <w:tcPr>
-            <w:tcW w:w="1250" w:type="dxa"/>
-            <w:tcBorders>
-              <w:top w:val="single" w:sz="4" w:color="333333"/>
-              <w:start w:val="single" w:sz="4" w:color="333333"/>
-              <w:bottom w:val="single" w:sz="4" w:color="333333"/>
-              <w:end w:val="single" w:sz="4" w:color="333333"/>
-            </w:tcBorders>
-            <w:tcMar>
-              <w:top w:w="60" w:type="dxa"/>
-              <w:start w:w="100" w:type="dxa"/>
-              <w:bottom w:w="60" w:type="dxa"/>
-              <w:end w:w="100" w:type="dxa"/>
-            </w:tcMar>
-          </w:tcPr>
-          <w:p>
-            <w:pPr>
-              <w:spacing w:line="360" w:lineRule="auto"/>
-              <w:jc w:val="center"/>
-              <w:rPr>
-                <w:color w:val="333333"/>
-                <w:sz w:val="20"/>
-                <w:szCs w:val="20"/>
-              </w:rPr>
-            </w:pPr>
-            <w:r>
-              <w:rPr>
-                <w:color w:val="333333"/>
-                <w:sz w:val="20"/>
-                <w:szCs w:val="20"/>
-              </w:rPr>
-              <w:t xml:space="preserve">35</w:t>
-            </w:r>
-          </w:p>
-        </w:tc>
-        <w:tc>
-          <w:tcPr>
-            <w:tcW w:w="1250" w:type="dxa"/>
-            <w:tcBorders>
-              <w:top w:val="single" w:sz="4" w:color="333333"/>
-              <w:start w:val="single" w:sz="4" w:color="333333"/>
-              <w:bottom w:val="single" w:sz="4" w:color="333333"/>
-              <w:end w:val="single" w:sz="4" w:color="333333"/>
-            </w:tcBorders>
-            <w:tcMar>
-              <w:top w:w="60" w:type="dxa"/>
-              <w:start w:w="100" w:type="dxa"/>
-              <w:bottom w:w="60" w:type="dxa"/>
-              <w:end w:w="100" w:type="dxa"/>
-            </w:tcMar>
-          </w:tcPr>
-          <w:p>
-            <w:pPr>
-              <w:spacing w:line="360" w:lineRule="auto"/>
-              <w:jc w:val="center"/>
-              <w:rPr>
-                <w:color w:val="333333"/>
-                <w:sz w:val="20"/>
-                <w:szCs w:val="20"/>
-              </w:rPr>
-            </w:pPr>
-            <w:r>
-              <w:rPr>
-                <w:color w:val="333333"/>
-                <w:sz w:val="20"/>
-                <w:szCs w:val="20"/>
-              </w:rPr>
-              <w:t xml:space="preserve">80</w:t>
-            </w:r>
-          </w:p>
-        </w:tc>
-      </w:tr>
-      <w:tr>
-        <w:tc>
-          <w:tcPr>
-            <w:tcW w:w="1400" w:type="dxa"/>
-            <w:tcBorders>
-              <w:top w:val="single" w:sz="4" w:color="333333"/>
-              <w:start w:val="single" w:sz="4" w:color="333333"/>
-              <w:bottom w:val="single" w:sz="4" w:color="333333"/>
-              <w:end w:val="single" w:sz="4" w:color="333333"/>
-            </w:tcBorders>
-            <w:tcMar>
-              <w:top w:w="60" w:type="dxa"/>
-              <w:start w:w="100" w:type="dxa"/>
-              <w:bottom w:w="60" w:type="dxa"/>
-              <w:end w:w="100" w:type="dxa"/>
-            </w:tcMar>
-          </w:tcPr>
-          <w:p>
-            <w:pPr>
-              <w:spacing w:line="360" w:lineRule="auto"/>
-              <w:jc w:val="center"/>
-              <w:rPr>
-                <w:color w:val="333333"/>
-                <w:sz w:val="20"/>
-                <w:szCs w:val="20"/>
-              </w:rPr>
-            </w:pPr>
-            <w:r>
-              <w:rPr>
-                <w:color w:val="333333"/>
-                <w:sz w:val="20"/>
-                <w:szCs w:val="20"/>
-              </w:rPr>
-              <w:t xml:space="preserve">PPTX</w:t>
-            </w:r>
-          </w:p>
-        </w:tc>
-        <w:tc>
-          <w:tcPr>
-            <w:tcW w:w="1900" w:type="dxa"/>
-            <w:tcBorders>
-              <w:top w:val="single" w:sz="4" w:color="333333"/>
-              <w:start w:val="single" w:sz="4" w:color="333333"/>
-              <w:bottom w:val="single" w:sz="4" w:color="333333"/>
-              <w:end w:val="single" w:sz="4" w:color="333333"/>
-            </w:tcBorders>
-            <w:tcMar>
-              <w:top w:w="60" w:type="dxa"/>
-              <w:start w:w="100" w:type="dxa"/>
-              <w:bottom w:w="60" w:type="dxa"/>
-              <w:end w:w="100" w:type="dxa"/>
-            </w:tcMar>
-          </w:tcPr>
-          <w:p>
-            <w:pPr>
-              <w:spacing w:line="360" w:lineRule="auto"/>
-              <w:jc w:val="center"/>
-              <w:rPr>
-                <w:color w:val="333333"/>
-                <w:sz w:val="20"/>
-                <w:szCs w:val="20"/>
-              </w:rPr>
-            </w:pPr>
-            <w:r>
-              <w:rPr>
-                <w:color w:val="333333"/>
-                <w:sz w:val="20"/>
-                <w:szCs w:val="20"/>
-              </w:rPr>
-              <w:t xml:space="preserve">80%</w:t>
-            </w:r>
-          </w:p>
-        </w:tc>
-        <w:tc>
-          <w:tcPr>
-            <w:tcW w:w="1900" w:type="dxa"/>
-            <w:tcBorders>
-              <w:top w:val="single" w:sz="4" w:color="333333"/>
-              <w:start w:val="single" w:sz="4" w:color="333333"/>
-              <w:bottom w:val="single" w:sz="4" w:color="333333"/>
-              <w:end w:val="single" w:sz="4" w:color="333333"/>
-            </w:tcBorders>
-            <w:tcMar>
-              <w:top w:w="60" w:type="dxa"/>
-              <w:start w:w="100" w:type="dxa"/>
-              <w:bottom w:w="60" w:type="dxa"/>
-              <w:end w:w="100" w:type="dxa"/>
-            </w:tcMar>
-          </w:tcPr>
-          <w:p>
-            <w:pPr>
-              <w:spacing w:line="360" w:lineRule="auto"/>
-              <w:jc w:val="center"/>
-              <w:rPr>
-                <w:color w:val="333333"/>
-                <w:sz w:val="20"/>
-                <w:szCs w:val="20"/>
-              </w:rPr>
-            </w:pPr>
-            <w:r>
-              <w:rPr>
-                <w:color w:val="333333"/>
-                <w:sz w:val="20"/>
-                <w:szCs w:val="20"/>
-              </w:rPr>
-              <w:t xml:space="preserve">78%</w:t>
-            </w:r>
-          </w:p>
-        </w:tc>
-        <w:tc>
-          <w:tcPr>
-            <w:tcW w:w="1300" w:type="dxa"/>
-            <w:tcBorders>
-              <w:top w:val="single" w:sz="4" w:color="333333"/>
-              <w:start w:val="single" w:sz="4" w:color="333333"/>
-              <w:bottom w:val="single" w:sz="4" w:color="333333"/>
-              <w:end w:val="single" w:sz="4" w:color="333333"/>
-            </w:tcBorders>
-            <w:tcMar>
-              <w:top w:w="60" w:type="dxa"/>
-              <w:start w:w="100" w:type="dxa"/>
-              <w:bottom w:w="60" w:type="dxa"/>
-              <w:end w:w="100" w:type="dxa"/>
-            </w:tcMar>
-          </w:tcPr>
-          <w:p>
-            <w:pPr>
-              <w:spacing w:line="360" w:lineRule="auto"/>
-              <w:jc w:val="center"/>
-              <w:rPr>
-                <w:color w:val="333333"/>
-                <w:sz w:val="20"/>
-                <w:szCs w:val="20"/>
-              </w:rPr>
-            </w:pPr>
-            <w:r>
-              <w:rPr>
-                <w:color w:val="333333"/>
-                <w:sz w:val="20"/>
-                <w:szCs w:val="20"/>
-              </w:rPr>
-              <w:t xml:space="preserve">0,013</w:t>
-            </w:r>
-          </w:p>
-        </w:tc>
-        <w:tc>
-          <w:tcPr>
-            <w:tcW w:w="1250" w:type="dxa"/>
-            <w:tcBorders>
-              <w:top w:val="single" w:sz="4" w:color="333333"/>
-              <w:start w:val="single" w:sz="4" w:color="333333"/>
-              <w:bottom w:val="single" w:sz="4" w:color="333333"/>
-              <w:end w:val="single" w:sz="4" w:color="333333"/>
-            </w:tcBorders>
-            <w:tcMar>
-              <w:top w:w="60" w:type="dxa"/>
-              <w:start w:w="100" w:type="dxa"/>
-              <w:bottom w:w="60" w:type="dxa"/>
-              <w:end w:w="100" w:type="dxa"/>
-            </w:tcMar>
-          </w:tcPr>
-          <w:p>
-            <w:pPr>
-              <w:spacing w:line="360" w:lineRule="auto"/>
-              <w:jc w:val="center"/>
-              <w:rPr>
-                <w:color w:val="333333"/>
-                <w:sz w:val="20"/>
-                <w:szCs w:val="20"/>
-              </w:rPr>
-            </w:pPr>
-            <w:r>
-              <w:rPr>
-                <w:color w:val="333333"/>
-                <w:sz w:val="20"/>
-                <w:szCs w:val="20"/>
-              </w:rPr>
-              <w:t xml:space="preserve">52</w:t>
-            </w:r>
-          </w:p>
-        </w:tc>
-        <w:tc>
-          <w:tcPr>
-            <w:tcW w:w="1250" w:type="dxa"/>
-            <w:tcBorders>
-              <w:top w:val="single" w:sz="4" w:color="333333"/>
-              <w:start w:val="single" w:sz="4" w:color="333333"/>
-              <w:bottom w:val="single" w:sz="4" w:color="333333"/>
-              <w:end w:val="single" w:sz="4" w:color="333333"/>
-            </w:tcBorders>
-            <w:tcMar>
-              <w:top w:w="60" w:type="dxa"/>
-              <w:start w:w="100" w:type="dxa"/>
-              <w:bottom w:w="60" w:type="dxa"/>
-              <w:end w:w="100" w:type="dxa"/>
-            </w:tcMar>
-          </w:tcPr>
-          <w:p>
-            <w:pPr>
-              <w:spacing w:line="360" w:lineRule="auto"/>
-              <w:jc w:val="center"/>
-              <w:rPr>
-                <w:color w:val="333333"/>
-                <w:sz w:val="20"/>
-                <w:szCs w:val="20"/>
-              </w:rPr>
-            </w:pPr>
-            <w:r>
-              <w:rPr>
-                <w:color w:val="333333"/>
-                <w:sz w:val="20"/>
-                <w:szCs w:val="20"/>
-              </w:rPr>
-              <w:t xml:space="preserve">125</w:t>
-            </w:r>
-          </w:p>
-        </w:tc>
-      </w:tr>
-      <w:tr>
-        <w:tc>
-          <w:tcPr>
-            <w:tcW w:w="1400" w:type="dxa"/>
-            <w:tcBorders>
-              <w:top w:val="single" w:sz="4" w:color="333333"/>
-              <w:start w:val="single" w:sz="4" w:color="333333"/>
-              <w:bottom w:val="single" w:sz="4" w:color="333333"/>
-              <w:end w:val="single" w:sz="4" w:color="333333"/>
-            </w:tcBorders>
-            <w:tcMar>
-              <w:top w:w="60" w:type="dxa"/>
-              <w:start w:w="100" w:type="dxa"/>
-              <w:bottom w:w="60" w:type="dxa"/>
-              <w:end w:w="100" w:type="dxa"/>
-            </w:tcMar>
-          </w:tcPr>
-          <w:p>
-            <w:pPr>
-              <w:spacing w:line="360" w:lineRule="auto"/>
-              <w:jc w:val="center"/>
-              <w:rPr>
-                <w:color w:val="333333"/>
-                <w:sz w:val="20"/>
-                <w:szCs w:val="20"/>
-              </w:rPr>
-            </w:pPr>
-            <w:r>
-              <w:rPr>
-                <w:color w:val="333333"/>
-                <w:sz w:val="20"/>
-                <w:szCs w:val="20"/>
-              </w:rPr>
-              <w:t xml:space="preserve">Imagem</w:t>
-            </w:r>
-          </w:p>
-        </w:tc>
-        <w:tc>
-          <w:tcPr>
-            <w:tcW w:w="1900" w:type="dxa"/>
-            <w:tcBorders>
-              <w:top w:val="single" w:sz="4" w:color="333333"/>
-              <w:start w:val="single" w:sz="4" w:color="333333"/>
-              <w:bottom w:val="single" w:sz="4" w:color="333333"/>
-              <w:end w:val="single" w:sz="4" w:color="333333"/>
-            </w:tcBorders>
-            <w:tcMar>
-              <w:top w:w="60" w:type="dxa"/>
-              <w:start w:w="100" w:type="dxa"/>
-              <w:bottom w:w="60" w:type="dxa"/>
-              <w:end w:w="100" w:type="dxa"/>
-            </w:tcMar>
-          </w:tcPr>
-          <w:p>
-            <w:pPr>
-              <w:spacing w:line="360" w:lineRule="auto"/>
-              <w:jc w:val="center"/>
-              <w:rPr>
-                <w:color w:val="333333"/>
-                <w:sz w:val="20"/>
-                <w:szCs w:val="20"/>
-              </w:rPr>
-            </w:pPr>
-            <w:r>
-              <w:rPr>
-                <w:color w:val="333333"/>
-                <w:sz w:val="20"/>
-                <w:szCs w:val="20"/>
-              </w:rPr>
-              <w:t xml:space="preserve">70%</w:t>
-            </w:r>
-          </w:p>
-        </w:tc>
-        <w:tc>
-          <w:tcPr>
-            <w:tcW w:w="1900" w:type="dxa"/>
-            <w:tcBorders>
-              <w:top w:val="single" w:sz="4" w:color="333333"/>
-              <w:start w:val="single" w:sz="4" w:color="333333"/>
-              <w:bottom w:val="single" w:sz="4" w:color="333333"/>
-              <w:end w:val="single" w:sz="4" w:color="333333"/>
-            </w:tcBorders>
-            <w:tcMar>
-              <w:top w:w="60" w:type="dxa"/>
-              <w:start w:w="100" w:type="dxa"/>
-              <w:bottom w:w="60" w:type="dxa"/>
-              <w:end w:w="100" w:type="dxa"/>
-            </w:tcMar>
-          </w:tcPr>
-          <w:p>
-            <w:pPr>
-              <w:spacing w:line="360" w:lineRule="auto"/>
-              <w:jc w:val="center"/>
-              <w:rPr>
-                <w:color w:val="333333"/>
-                <w:sz w:val="20"/>
-                <w:szCs w:val="20"/>
-              </w:rPr>
-            </w:pPr>
-            <w:r>
-              <w:rPr>
-                <w:color w:val="333333"/>
-                <w:sz w:val="20"/>
-                <w:szCs w:val="20"/>
-              </w:rPr>
-              <w:t xml:space="preserve">65%</w:t>
-            </w:r>
-          </w:p>
-        </w:tc>
-        <w:tc>
-          <w:tcPr>
-            <w:tcW w:w="1300" w:type="dxa"/>
-            <w:tcBorders>
-              <w:top w:val="single" w:sz="4" w:color="333333"/>
-              <w:start w:val="single" w:sz="4" w:color="333333"/>
-              <w:bottom w:val="single" w:sz="4" w:color="333333"/>
-              <w:end w:val="single" w:sz="4" w:color="333333"/>
-            </w:tcBorders>
-            <w:tcMar>
-              <w:top w:w="60" w:type="dxa"/>
-              <w:start w:w="100" w:type="dxa"/>
-              <w:bottom w:w="60" w:type="dxa"/>
-              <w:end w:w="100" w:type="dxa"/>
-            </w:tcMar>
-          </w:tcPr>
-          <w:p>
-            <w:pPr>
-              <w:spacing w:line="360" w:lineRule="auto"/>
-              <w:jc w:val="center"/>
-              <w:rPr>
-                <w:color w:val="333333"/>
-                <w:sz w:val="20"/>
-                <w:szCs w:val="20"/>
-              </w:rPr>
-            </w:pPr>
-            <w:r>
-              <w:rPr>
-                <w:color w:val="333333"/>
-                <w:sz w:val="20"/>
-                <w:szCs w:val="20"/>
-              </w:rPr>
-              <w:t xml:space="preserve">0,025</w:t>
-            </w:r>
-          </w:p>
-        </w:tc>
-        <w:tc>
-          <w:tcPr>
-            <w:tcW w:w="1250" w:type="dxa"/>
-            <w:tcBorders>
-              <w:top w:val="single" w:sz="4" w:color="333333"/>
-              <w:start w:val="single" w:sz="4" w:color="333333"/>
-              <w:bottom w:val="single" w:sz="4" w:color="333333"/>
-              <w:end w:val="single" w:sz="4" w:color="333333"/>
-            </w:tcBorders>
-            <w:tcMar>
-              <w:top w:w="60" w:type="dxa"/>
-              <w:start w:w="100" w:type="dxa"/>
-              <w:bottom w:w="60" w:type="dxa"/>
-              <w:end w:w="100" w:type="dxa"/>
-            </w:tcMar>
-          </w:tcPr>
-          <w:p>
-            <w:pPr>
-              <w:spacing w:line="360" w:lineRule="auto"/>
-              <w:jc w:val="center"/>
-              <w:rPr>
-                <w:color w:val="333333"/>
-                <w:sz w:val="20"/>
-                <w:szCs w:val="20"/>
-              </w:rPr>
-            </w:pPr>
-            <w:r>
-              <w:rPr>
-                <w:color w:val="333333"/>
-                <w:sz w:val="20"/>
-                <w:szCs w:val="20"/>
-              </w:rPr>
-              <w:t xml:space="preserve">65</w:t>
-            </w:r>
-          </w:p>
-        </w:tc>
-        <w:tc>
-          <w:tcPr>
-            <w:tcW w:w="1250" w:type="dxa"/>
-            <w:tcBorders>
-              <w:top w:val="single" w:sz="4" w:color="333333"/>
-              <w:start w:val="single" w:sz="4" w:color="333333"/>
-              <w:bottom w:val="single" w:sz="4" w:color="333333"/>
-              <w:end w:val="single" w:sz="4" w:color="333333"/>
-            </w:tcBorders>
-            <w:tcMar>
-              <w:top w:w="60" w:type="dxa"/>
-              <w:start w:w="100" w:type="dxa"/>
-              <w:bottom w:w="60" w:type="dxa"/>
-              <w:end w:w="100" w:type="dxa"/>
-            </w:tcMar>
-          </w:tcPr>
-          <w:p>
-            <w:pPr>
-              <w:spacing w:line="360" w:lineRule="auto"/>
-              <w:jc w:val="center"/>
-              <w:rPr>
-                <w:color w:val="333333"/>
-                <w:sz w:val="20"/>
-                <w:szCs w:val="20"/>
-              </w:rPr>
-            </w:pPr>
-            <w:r>
-              <w:rPr>
-                <w:color w:val="333333"/>
-                <w:sz w:val="20"/>
-                <w:szCs w:val="20"/>
-              </w:rPr>
-              <w:t xml:space="preserve">145</w:t>
-            </w:r>
-          </w:p>
-        </w:tc>
-      </w:tr>
-      <w:tr>
-        <w:tc>
-          <w:tcPr>
-            <w:tcW w:w="1400" w:type="dxa"/>
-            <w:tcBorders>
-              <w:top w:val="single" w:sz="4" w:color="333333"/>
-              <w:start w:val="single" w:sz="4" w:color="333333"/>
-              <w:bottom w:val="single" w:sz="4" w:color="333333"/>
-              <w:end w:val="single" w:sz="4" w:color="333333"/>
-            </w:tcBorders>
-            <w:tcMar>
-              <w:top w:w="60" w:type="dxa"/>
-              <w:start w:w="100" w:type="dxa"/>
-              <w:bottom w:w="60" w:type="dxa"/>
-              <w:end w:w="100" w:type="dxa"/>
-            </w:tcMar>
-          </w:tcPr>
-          <w:p>
-            <w:pPr>
-              <w:spacing w:line="360" w:lineRule="auto"/>
-              <w:jc w:val="center"/>
-              <w:rPr>
-                <w:color w:val="333333"/>
-                <w:sz w:val="20"/>
-                <w:szCs w:val="20"/>
-              </w:rPr>
-            </w:pPr>
-            <w:r>
-              <w:rPr>
-                <w:color w:val="333333"/>
-                <w:sz w:val="20"/>
-                <w:szCs w:val="20"/>
-              </w:rPr>
-              <w:t xml:space="preserve">Markdown</w:t>
-            </w:r>
-          </w:p>
-        </w:tc>
-        <w:tc>
-          <w:tcPr>
-            <w:tcW w:w="1900" w:type="dxa"/>
-            <w:tcBorders>
-              <w:top w:val="single" w:sz="4" w:color="333333"/>
-              <w:start w:val="single" w:sz="4" w:color="333333"/>
-              <w:bottom w:val="single" w:sz="4" w:color="333333"/>
-              <w:end w:val="single" w:sz="4" w:color="333333"/>
-            </w:tcBorders>
-            <w:tcMar>
-              <w:top w:w="60" w:type="dxa"/>
-              <w:start w:w="100" w:type="dxa"/>
-              <w:bottom w:w="60" w:type="dxa"/>
-              <w:end w:w="100" w:type="dxa"/>
-            </w:tcMar>
-          </w:tcPr>
-          <w:p>
-            <w:pPr>
-              <w:spacing w:line="360" w:lineRule="auto"/>
-              <w:jc w:val="center"/>
-              <w:rPr>
-                <w:color w:val="333333"/>
-                <w:sz w:val="20"/>
-                <w:szCs w:val="20"/>
-              </w:rPr>
-            </w:pPr>
-            <w:r>
-              <w:rPr>
-                <w:color w:val="333333"/>
-                <w:sz w:val="20"/>
-                <w:szCs w:val="20"/>
-              </w:rPr>
-              <w:t xml:space="preserve">100%</w:t>
-            </w:r>
-          </w:p>
-        </w:tc>
-        <w:tc>
-          <w:tcPr>
-            <w:tcW w:w="1900" w:type="dxa"/>
-            <w:tcBorders>
-              <w:top w:val="single" w:sz="4" w:color="333333"/>
-              <w:start w:val="single" w:sz="4" w:color="333333"/>
-              <w:bottom w:val="single" w:sz="4" w:color="333333"/>
-              <w:end w:val="single" w:sz="4" w:color="333333"/>
-            </w:tcBorders>
-            <w:tcMar>
-              <w:top w:w="60" w:type="dxa"/>
-              <w:start w:w="100" w:type="dxa"/>
-              <w:bottom w:w="60" w:type="dxa"/>
-              <w:end w:w="100" w:type="dxa"/>
-            </w:tcMar>
-          </w:tcPr>
-          <w:p>
-            <w:pPr>
-              <w:spacing w:line="360" w:lineRule="auto"/>
-              <w:jc w:val="center"/>
-              <w:rPr>
-                <w:color w:val="333333"/>
-                <w:sz w:val="20"/>
-                <w:szCs w:val="20"/>
-              </w:rPr>
-            </w:pPr>
-            <w:r>
-              <w:rPr>
-                <w:color w:val="333333"/>
-                <w:sz w:val="20"/>
-                <w:szCs w:val="20"/>
-              </w:rPr>
-              <w:t xml:space="preserve">95%</w:t>
-            </w:r>
-          </w:p>
-        </w:tc>
-        <w:tc>
-          <w:tcPr>
-            <w:tcW w:w="1300" w:type="dxa"/>
-            <w:tcBorders>
-              <w:top w:val="single" w:sz="4" w:color="333333"/>
-              <w:start w:val="single" w:sz="4" w:color="333333"/>
-              <w:bottom w:val="single" w:sz="4" w:color="333333"/>
-              <w:end w:val="single" w:sz="4" w:color="333333"/>
-            </w:tcBorders>
-            <w:tcMar>
-              <w:top w:w="60" w:type="dxa"/>
-              <w:start w:w="100" w:type="dxa"/>
-              <w:bottom w:w="60" w:type="dxa"/>
-              <w:end w:w="100" w:type="dxa"/>
-            </w:tcMar>
-          </w:tcPr>
-          <w:p>
-            <w:pPr>
-              <w:spacing w:line="360" w:lineRule="auto"/>
-              <w:jc w:val="center"/>
-              <w:rPr>
-                <w:color w:val="333333"/>
-                <w:sz w:val="20"/>
-                <w:szCs w:val="20"/>
-              </w:rPr>
-            </w:pPr>
-            <w:r>
-              <w:rPr>
-                <w:color w:val="333333"/>
-                <w:sz w:val="20"/>
-                <w:szCs w:val="20"/>
-              </w:rPr>
-              <w:t xml:space="preserve">0,005</w:t>
-            </w:r>
-          </w:p>
-        </w:tc>
-        <w:tc>
-          <w:tcPr>
-            <w:tcW w:w="1250" w:type="dxa"/>
-            <w:tcBorders>
-              <w:top w:val="single" w:sz="4" w:color="333333"/>
-              <w:start w:val="single" w:sz="4" w:color="333333"/>
-              <w:bottom w:val="single" w:sz="4" w:color="333333"/>
-              <w:end w:val="single" w:sz="4" w:color="333333"/>
-            </w:tcBorders>
-            <w:tcMar>
-              <w:top w:w="60" w:type="dxa"/>
-              <w:start w:w="100" w:type="dxa"/>
-              <w:bottom w:w="60" w:type="dxa"/>
-              <w:end w:w="100" w:type="dxa"/>
-            </w:tcMar>
-          </w:tcPr>
-          <w:p>
-            <w:pPr>
-              <w:spacing w:line="360" w:lineRule="auto"/>
-              <w:jc w:val="center"/>
-              <w:rPr>
-                <w:color w:val="333333"/>
-                <w:sz w:val="20"/>
-                <w:szCs w:val="20"/>
-              </w:rPr>
-            </w:pPr>
-            <w:r>
-              <w:rPr>
-                <w:color w:val="333333"/>
-                <w:sz w:val="20"/>
-                <w:szCs w:val="20"/>
-              </w:rPr>
-              <w:t xml:space="preserve">18</w:t>
-            </w:r>
-          </w:p>
-        </w:tc>
-        <w:tc>
-          <w:tcPr>
-            <w:tcW w:w="1250" w:type="dxa"/>
-            <w:tcBorders>
-              <w:top w:val="single" w:sz="4" w:color="333333"/>
-              <w:start w:val="single" w:sz="4" w:color="333333"/>
-              <w:bottom w:val="single" w:sz="4" w:color="333333"/>
-              <w:end w:val="single" w:sz="4" w:color="333333"/>
-            </w:tcBorders>
-            <w:tcMar>
-              <w:top w:w="60" w:type="dxa"/>
-              <w:start w:w="100" w:type="dxa"/>
-              <w:bottom w:w="60" w:type="dxa"/>
-              <w:end w:w="100" w:type="dxa"/>
-            </w:tcMar>
-          </w:tcPr>
-          <w:p>
-            <w:pPr>
-              <w:spacing w:line="360" w:lineRule="auto"/>
-              <w:jc w:val="center"/>
-              <w:rPr>
-                <w:color w:val="333333"/>
-                <w:sz w:val="20"/>
-                <w:szCs w:val="20"/>
-              </w:rPr>
-            </w:pPr>
-            <w:r>
-              <w:rPr>
-                <w:color w:val="333333"/>
-                <w:sz w:val="20"/>
-                <w:szCs w:val="20"/>
-              </w:rPr>
-              <w:t xml:space="preserve">42</w:t>
-            </w:r>
-          </w:p>
-        </w:tc>
-      </w:tr>
-      <w:tr>
-        <w:tc>
-          <w:tcPr>
-            <w:tcW w:w="1400" w:type="dxa"/>
-            <w:tcBorders>
-              <w:top w:val="single" w:sz="4" w:color="333333"/>
-              <w:start w:val="single" w:sz="4" w:color="333333"/>
-              <w:bottom w:val="single" w:sz="4" w:color="333333"/>
-              <w:end w:val="single" w:sz="4" w:color="333333"/>
-            </w:tcBorders>
-            <w:tcMar>
-              <w:top w:w="60" w:type="dxa"/>
-              <w:start w:w="100" w:type="dxa"/>
-              <w:bottom w:w="60" w:type="dxa"/>
-              <w:end w:w="100" w:type="dxa"/>
-            </w:tcMar>
-          </w:tcPr>
-          <w:p>
-            <w:pPr>
-              <w:spacing w:line="360" w:lineRule="auto"/>
-              <w:jc w:val="center"/>
-              <w:rPr>
-                <w:b/>
-                <w:bCs/>
-                <w:color w:val="333333"/>
-                <w:sz w:val="20"/>
-                <w:szCs w:val="20"/>
-              </w:rPr>
-            </w:pPr>
-            <w:r>
-              <w:rPr>
-                <w:b/>
-                <w:bCs/>
-                <w:color w:val="333333"/>
-                <w:sz w:val="20"/>
-                <w:szCs w:val="20"/>
-              </w:rPr>
-              <w:t xml:space="preserve">Total</w:t>
-            </w:r>
-          </w:p>
-        </w:tc>
-        <w:tc>
-          <w:tcPr>
-            <w:tcW w:w="1900" w:type="dxa"/>
-            <w:tcBorders>
-              <w:top w:val="single" w:sz="4" w:color="333333"/>
-              <w:start w:val="single" w:sz="4" w:color="333333"/>
-              <w:bottom w:val="single" w:sz="4" w:color="333333"/>
-              <w:end w:val="single" w:sz="4" w:color="333333"/>
-            </w:tcBorders>
-            <w:tcMar>
-              <w:top w:w="60" w:type="dxa"/>
-              <w:start w:w="100" w:type="dxa"/>
-              <w:bottom w:w="60" w:type="dxa"/>
-              <w:end w:w="100" w:type="dxa"/>
-            </w:tcMar>
-          </w:tcPr>
-          <w:p>
-            <w:pPr>
-              <w:spacing w:line="360" w:lineRule="auto"/>
-              <w:jc w:val="center"/>
-              <w:rPr>
-                <w:b/>
-                <w:bCs/>
-                <w:color w:val="333333"/>
-                <w:sz w:val="20"/>
-                <w:szCs w:val="20"/>
-              </w:rPr>
-            </w:pPr>
-            <w:r>
-              <w:rPr>
-                <w:b/>
-                <w:bCs/>
-                <w:color w:val="333333"/>
-                <w:sz w:val="20"/>
-                <w:szCs w:val="20"/>
-              </w:rPr>
-              <w:t xml:space="preserve">87%</w:t>
-            </w:r>
-          </w:p>
-        </w:tc>
-        <w:tc>
-          <w:tcPr>
-            <w:tcW w:w="1900" w:type="dxa"/>
-            <w:tcBorders>
-              <w:top w:val="single" w:sz="4" w:color="333333"/>
-              <w:start w:val="single" w:sz="4" w:color="333333"/>
-              <w:bottom w:val="single" w:sz="4" w:color="333333"/>
-              <w:end w:val="single" w:sz="4" w:color="333333"/>
-            </w:tcBorders>
-            <w:tcMar>
-              <w:top w:w="60" w:type="dxa"/>
-              <w:start w:w="100" w:type="dxa"/>
-              <w:bottom w:w="60" w:type="dxa"/>
-              <w:end w:w="100" w:type="dxa"/>
-            </w:tcMar>
-          </w:tcPr>
-          <w:p>
-            <w:pPr>
-              <w:spacing w:line="360" w:lineRule="auto"/>
-              <w:jc w:val="center"/>
-              <w:rPr>
-                <w:b/>
-                <w:bCs/>
-                <w:color w:val="333333"/>
-                <w:sz w:val="20"/>
-                <w:szCs w:val="20"/>
-              </w:rPr>
-            </w:pPr>
-            <w:r>
-              <w:rPr>
-                <w:b/>
-                <w:bCs/>
-                <w:color w:val="333333"/>
-                <w:sz w:val="20"/>
-                <w:szCs w:val="20"/>
-              </w:rPr>
-              <w:t xml:space="preserve">83%</w:t>
-            </w:r>
-          </w:p>
-        </w:tc>
-        <w:tc>
-          <w:tcPr>
-            <w:tcW w:w="1300" w:type="dxa"/>
-            <w:tcBorders>
-              <w:top w:val="single" w:sz="4" w:color="333333"/>
-              <w:start w:val="single" w:sz="4" w:color="333333"/>
-              <w:bottom w:val="single" w:sz="4" w:color="333333"/>
-              <w:end w:val="single" w:sz="4" w:color="333333"/>
-            </w:tcBorders>
-            <w:tcMar>
-              <w:top w:w="60" w:type="dxa"/>
-              <w:start w:w="100" w:type="dxa"/>
-              <w:bottom w:w="60" w:type="dxa"/>
-              <w:end w:w="100" w:type="dxa"/>
-            </w:tcMar>
-          </w:tcPr>
-          <w:p>
-            <w:pPr>
-              <w:spacing w:line="360" w:lineRule="auto"/>
-              <w:jc w:val="center"/>
-              <w:rPr>
-                <w:b/>
-                <w:bCs/>
-                <w:color w:val="333333"/>
-                <w:sz w:val="20"/>
-                <w:szCs w:val="20"/>
-              </w:rPr>
-            </w:pPr>
-            <w:r>
-              <w:rPr>
-                <w:b/>
-                <w:bCs/>
-                <w:color w:val="333333"/>
-                <w:sz w:val="20"/>
-                <w:szCs w:val="20"/>
-              </w:rPr>
-              <w:t xml:space="preserve">0,013</w:t>
-            </w:r>
-          </w:p>
-        </w:tc>
-        <w:tc>
-          <w:tcPr>
-            <w:tcW w:w="1250" w:type="dxa"/>
-            <w:tcBorders>
-              <w:top w:val="single" w:sz="4" w:color="333333"/>
-              <w:start w:val="single" w:sz="4" w:color="333333"/>
-              <w:bottom w:val="single" w:sz="4" w:color="333333"/>
-              <w:end w:val="single" w:sz="4" w:color="333333"/>
-            </w:tcBorders>
-            <w:tcMar>
-              <w:top w:w="60" w:type="dxa"/>
-              <w:start w:w="100" w:type="dxa"/>
-              <w:bottom w:w="60" w:type="dxa"/>
-              <w:end w:w="100" w:type="dxa"/>
-            </w:tcMar>
-          </w:tcPr>
-          <w:p>
-            <w:pPr>
-              <w:spacing w:line="360" w:lineRule="auto"/>
-              <w:jc w:val="center"/>
-              <w:rPr>
-                <w:b/>
-                <w:bCs/>
-                <w:color w:val="333333"/>
-                <w:sz w:val="20"/>
-                <w:szCs w:val="20"/>
-              </w:rPr>
-            </w:pPr>
-            <w:r>
-              <w:rPr>
-                <w:b/>
-                <w:bCs/>
-                <w:color w:val="333333"/>
-                <w:sz w:val="20"/>
-                <w:szCs w:val="20"/>
-              </w:rPr>
-              <w:t xml:space="preserve">43</w:t>
-            </w:r>
-          </w:p>
-        </w:tc>
-        <w:tc>
-          <w:tcPr>
-            <w:tcW w:w="1250" w:type="dxa"/>
-            <w:tcBorders>
-              <w:top w:val="single" w:sz="4" w:color="333333"/>
-              <w:start w:val="single" w:sz="4" w:color="333333"/>
-              <w:bottom w:val="single" w:sz="4" w:color="333333"/>
-              <w:end w:val="single" w:sz="4" w:color="333333"/>
-            </w:tcBorders>
-            <w:tcMar>
-              <w:top w:w="60" w:type="dxa"/>
-              <w:start w:w="100" w:type="dxa"/>
-              <w:bottom w:w="60" w:type="dxa"/>
-              <w:end w:w="100" w:type="dxa"/>
-            </w:tcMar>
-          </w:tcPr>
-          <w:p>
-            <w:pPr>
-              <w:spacing w:line="360" w:lineRule="auto"/>
-              <w:jc w:val="center"/>
-              <w:rPr>
-                <w:b/>
-                <w:bCs/>
-                <w:color w:val="333333"/>
-                <w:sz w:val="20"/>
-                <w:szCs w:val="20"/>
-              </w:rPr>
-            </w:pPr>
-            <w:r>
-              <w:rPr>
-                <w:b/>
-                <w:bCs/>
-                <w:color w:val="333333"/>
-                <w:sz w:val="20"/>
-                <w:szCs w:val="20"/>
-              </w:rPr>
-              <w:t xml:space="preserve">110</w:t>
+              <w:t xml:space="preserve">Implementado</w:t>
             </w:r>
           </w:p>
         </w:tc>
@@ -3471,7 +3003,7 @@
           <w:sz w:val="24"/>
           <w:szCs w:val="24"/>
         </w:rPr>
-        <w:t xml:space="preserve">A taxa global de classificação correta atingiu 87%, superando o critério de aceitação estabelecido na Metodologia (igual ou superior a 80%). Documentos em Markdown registraram o melhor desempenho, em razão da estrutura semântica explícita já presente no formato. Imagens registraram a pior taxa (70%), consequência das variações de qualidade fotográfica e da presença de manuscrito em parte da amostra. A latência média (percentil 50) de 43 segundos por documento manteve-se dentro do limite imposto pelo ambiente Supabase Edge Functions, e o custo médio de US$ 0,013 por documento sugere viabilidade econômica do sistema mesmo em utilização contínua por grande número de estudantes.</w:t>
+        <w:t xml:space="preserve">Todos os componentes previstos no backlog foram implementados e integrados; parte deles, inclusive, foi estendida com funcionalidades além do escopo originalmente planejado. Cabe ressaltar, contudo, que a mensuração sistemática de desempenho — taxa de classificação correta, custo por documento e latência sobre um corpus controlado — foi desenhada como parte do protocolo de avaliação (Seção 3), mas não foi executada neste ciclo. Os indicadores quantitativos correspondentes ainda não foram apurados e a sua obtenção constitui etapa imediata de continuidade do trabalho.</w:t>
       </w:r>
     </w:p>
     <w:p>
@@ -3495,67 +3027,67 @@
           <w:sz w:val="24"/>
           <w:szCs w:val="24"/>
         </w:rPr>
-        <w:t xml:space="preserve">5.2. Resultados da avaliação com usuários</w:t>
-      </w:r>
-    </w:p>
-    <w:p>
-      <w:pPr>
-        <w:widowControl/>
-        <w:spacing w:line="360" w:lineRule="auto"/>
-        <w:jc w:val="both"/>
-        <w:rPr>
-          <w:color w:val="333333"/>
-          <w:sz w:val="24"/>
-          <w:szCs w:val="24"/>
-        </w:rPr>
-      </w:pPr>
-      <w:r>
-        <w:rPr>
-          <w:color w:val="333333"/>
-          <w:sz w:val="24"/>
-          <w:szCs w:val="24"/>
-        </w:rPr>
-        <w:t xml:space="preserve">A avaliação com usuários ocorreu entre os dias 8 e 27 de junho de 2026, com dez estudantes voluntários da UnB recrutados em seis cursos distintos: Engenharia de Produção (quatro participantes), Direito (dois), Ciência da Computação (um), Letras (um), Economia (um) e Administração (um). Os participantes relataram, em média, 1,4 anos de uso prévio de ferramentas de IA generativa para fins acadêmicos.</w:t>
-      </w:r>
-    </w:p>
-    <w:p>
-      <w:pPr>
-        <w:widowControl/>
-        <w:spacing w:line="360" w:lineRule="auto"/>
-        <w:jc w:val="both"/>
-        <w:rPr>
-          <w:color w:val="333333"/>
-          <w:sz w:val="24"/>
-          <w:szCs w:val="24"/>
-        </w:rPr>
-      </w:pPr>
-      <w:r>
-        <w:rPr>
-          <w:color w:val="333333"/>
-          <w:sz w:val="24"/>
-          <w:szCs w:val="24"/>
-        </w:rPr>
-        <w:t xml:space="preserve">A pontuação média obtida na System Usability Scale foi 76,3 (desvio-padrão de 8,7), classificação que corresponde ao patamar de usabilidade boa segundo Bangor, Kortum e Miller (2008). O questionário baseado no Technology Acceptance Model registrou média 4,2 (desvio-padrão de 0,6) para Utilidade Percebida e 4,0 (desvio-padrão de 0,7) para Facilidade de Uso Percebida, ambos em escala Likert de cinco pontos. O comparativo cronometrado entre o processo manual e o processo automatizado revelou redução média de 58% no tempo de organização dos materiais, superando o critério de aceitação de 50% definido previamente na Metodologia.</w:t>
-      </w:r>
-    </w:p>
-    <w:p>
-      <w:pPr>
-        <w:widowControl/>
-        <w:spacing w:line="360" w:lineRule="auto"/>
-        <w:jc w:val="both"/>
-        <w:rPr>
-          <w:color w:val="333333"/>
-          <w:sz w:val="24"/>
-          <w:szCs w:val="24"/>
-        </w:rPr>
-      </w:pPr>
-      <w:r>
-        <w:rPr>
-          <w:color w:val="333333"/>
-          <w:sz w:val="24"/>
-          <w:szCs w:val="24"/>
-        </w:rPr>
-        <w:t xml:space="preserve">A análise de conteúdo das entrevistas semiestruturadas (Bardin, 2011) identificou três categorias temáticas predominantes. A primeira, ganho de tempo percebido, agrupou comentários sobre economia de horas semanais antes despendidas em renomeação manual de arquivos e busca em pastas dispersas. A segunda, qualidade do resumo, reuniu observações positivas sobre a fidelidade das sínteses ao material original, com ressalvas a documentos manuscritos. A terceira, portabilidade do system prompt, capturou a percepção dos participantes acerca da vantagem de utilizar o resultado em qualquer LLM de sua preferência, em vez de ficar restrito a uma plataforma única. Como pontos críticos foram apontados a latência percebida em documentos extensos, a necessidade de configurar o Google Drive antes do primeiro uso e a curva de aprendizado para compreensão do conceito de system prompt.</w:t>
+        <w:t xml:space="preserve">5.2. Avaliação planejada e estado de execução</w:t>
+      </w:r>
+    </w:p>
+    <w:p>
+      <w:pPr>
+        <w:widowControl/>
+        <w:spacing w:line="360" w:lineRule="auto"/>
+        <w:jc w:val="both"/>
+        <w:rPr>
+          <w:color w:val="333333"/>
+          <w:sz w:val="24"/>
+          <w:szCs w:val="24"/>
+        </w:rPr>
+      </w:pPr>
+      <w:r>
+        <w:rPr>
+          <w:color w:val="333333"/>
+          <w:sz w:val="24"/>
+          <w:szCs w:val="24"/>
+        </w:rPr>
+        <w:t xml:space="preserve">A avaliação com usuários foi integralmente planejada segundo o protocolo descrito na Seção 3.4, prevendo dez estudantes voluntários da UnB de diferentes cursos, sessões individuais de aproximadamente 60 minutos e a aplicação dos instrumentos System Usability Scale (SUS), Technology Acceptance Model (TAM), comparativo cronometrado entre processo manual e automatizado e entrevista semiestruturada, com critérios de aceitação definidos previamente (Seção 3.5).</w:t>
+      </w:r>
+    </w:p>
+    <w:p>
+      <w:pPr>
+        <w:widowControl/>
+        <w:spacing w:line="360" w:lineRule="auto"/>
+        <w:jc w:val="both"/>
+        <w:rPr>
+          <w:color w:val="333333"/>
+          <w:sz w:val="24"/>
+          <w:szCs w:val="24"/>
+        </w:rPr>
+      </w:pPr>
+      <w:r>
+        <w:rPr>
+          <w:color w:val="333333"/>
+          <w:sz w:val="24"/>
+          <w:szCs w:val="24"/>
+        </w:rPr>
+        <w:t xml:space="preserve">A execução dessa avaliação, contudo, dependia da disponibilização do sistema em ambiente público, acessível aos participantes — etapa de implantação (deploy) que não foi concluída dentro da janela deste ciclo. Em consequência, a coleta de dados com usuários não foi realizada e nenhum resultado empírico de usabilidade, aceitação ou redução de tempo é reportado neste artigo. Optou-se deliberadamente por não apresentar valores estimados ou simulados, de modo a preservar a fidedignidade dos resultados.</w:t>
+      </w:r>
+    </w:p>
+    <w:p>
+      <w:pPr>
+        <w:widowControl/>
+        <w:spacing w:line="360" w:lineRule="auto"/>
+        <w:jc w:val="both"/>
+        <w:rPr>
+          <w:color w:val="333333"/>
+          <w:sz w:val="24"/>
+          <w:szCs w:val="24"/>
+        </w:rPr>
+      </w:pPr>
+      <w:r>
+        <w:rPr>
+          <w:color w:val="333333"/>
+          <w:sz w:val="24"/>
+          <w:szCs w:val="24"/>
+        </w:rPr>
+        <w:t xml:space="preserve">O roteiro da entrevista semiestruturada e o protocolo de análise de conteúdo (Bardin, 2011) foram igualmente preparados, prevendo a codificação dos relatos em categorias temáticas emergentes — por exemplo, ganho de tempo percebido, qualidade da síntese e portabilidade do system prompt. Esses instrumentos permanecem disponíveis para aplicação imediata assim que o sistema for publicado, possibilitando retomar a etapa de avaliação sem retrabalho de desenho metodológico.</w:t>
       </w:r>
     </w:p>
     <w:p>
@@ -3599,47 +3131,47 @@
           <w:sz w:val="24"/>
           <w:szCs w:val="24"/>
         </w:rPr>
-        <w:t xml:space="preserve">Os resultados convergem com achados recentes da literatura. A taxa de classificação correta de 87% situa-se próxima dos valores reportados por Ma, Martins e Lopes (2024) com o sistema RAGMan (98% em curso de programação, contexto mais restrito) e por Furst e Venkateshwaran (2026) com o sistema Stan (intervalo entre 80% e 90% em transcrições de aula de termodinâmica). A pontuação SUS de 76,3 alinha-se ao patamar reportado por Feng, Liu e Ghosal (2024) no sistema CourseAssist (entre 74 e 79 em seis cursos).</w:t>
-      </w:r>
-    </w:p>
-    <w:p>
-      <w:pPr>
-        <w:widowControl/>
-        <w:spacing w:line="360" w:lineRule="auto"/>
-        <w:jc w:val="both"/>
-        <w:rPr>
-          <w:color w:val="333333"/>
-          <w:sz w:val="24"/>
-          <w:szCs w:val="24"/>
-        </w:rPr>
-      </w:pPr>
-      <w:r>
-        <w:rPr>
-          <w:color w:val="333333"/>
-          <w:sz w:val="24"/>
-          <w:szCs w:val="24"/>
-        </w:rPr>
-        <w:t xml:space="preserve">A redução de 58% no tempo de organização sustenta a hipótese de Beale (2025) de que a barreira de adoção das ferramentas de IA generativa reside menos na tecnologia em si e mais no esforço de preparar contexto adequado. O comparativo cronometrado oferece evidência quantitativa de que automatizar essa preparação produz ganho mensurável de produtividade acadêmica, em linha com os achados qualitativos de Silva e Kampff (2025) sobre as percepções discentes acerca da IA na licenciatura.</w:t>
-      </w:r>
-    </w:p>
-    <w:p>
-      <w:pPr>
-        <w:widowControl/>
-        <w:spacing w:line="360" w:lineRule="auto"/>
-        <w:jc w:val="both"/>
-        <w:rPr>
-          <w:color w:val="333333"/>
-          <w:sz w:val="24"/>
-          <w:szCs w:val="24"/>
-        </w:rPr>
-      </w:pPr>
-      <w:r>
-        <w:rPr>
-          <w:color w:val="333333"/>
-          <w:sz w:val="24"/>
-          <w:szCs w:val="24"/>
-        </w:rPr>
-        <w:t xml:space="preserve">A diferenciação central do artefato — geração de saída portátil em vez de plataforma fechada — foi percebida positivamente pelos participantes e representa a contribuição distintiva da pesquisa em relação aos sistemas mapeados. Os dados publicados pelo Comitê Gestor da Internet no Brasil (CGI.br, 2025) corroboram a relevância dessa abordagem: enquanto 70% dos estudantes brasileiros do ensino médio já utilizam IA generativa em pesquisas escolares, apenas cerca de um terço afirmam ter recebido orientação estruturada sobre como utilizá-las. Soluções que estruturam o uso da IA generativa, sem aprisionar o estudante em plataformas únicas, atendem demanda concreta identificada também no contexto universitário.</w:t>
+        <w:t xml:space="preserve">Na ausência de dados empíricos próprios, a discussão situa-se no plano do projeto do artefato e de sua aderência à literatura. Os sistemas mapeados na Seção 2 — como o RAGMan, de Ma, Martins e Lopes (2024), o Stan, de Furst e Venkateshwaran (2026), e o CourseAssist, de Feng, Liu e Ghosal (2024) — reportam altas taxas de adequação pedagógica e patamares de usabilidade considerados bons, oferecendo parâmetros de referência contra os quais o desempenho do presente artefato deverá ser confrontado quando a avaliação for executada.</w:t>
+      </w:r>
+    </w:p>
+    <w:p>
+      <w:pPr>
+        <w:widowControl/>
+        <w:spacing w:line="360" w:lineRule="auto"/>
+        <w:jc w:val="both"/>
+        <w:rPr>
+          <w:color w:val="333333"/>
+          <w:sz w:val="24"/>
+          <w:szCs w:val="24"/>
+        </w:rPr>
+      </w:pPr>
+      <w:r>
+        <w:rPr>
+          <w:color w:val="333333"/>
+          <w:sz w:val="24"/>
+          <w:szCs w:val="24"/>
+        </w:rPr>
+        <w:t xml:space="preserve">A própria motivação do artefato dialoga com a hipótese de Beale (2025) de que a barreira de adoção das ferramentas de IA generativa reside menos na tecnologia em si e mais no esforço de preparar contexto adequado. A verificação empírica de que a automatização dessa preparação produz ganho mensurável de produtividade — por meio do comparativo cronometrado previsto no protocolo — permanece como hipótese a ser testada, em diálogo com os achados qualitativos de Silva e Kampff (2025) sobre as percepções discentes acerca da IA na licenciatura.</w:t>
+      </w:r>
+    </w:p>
+    <w:p>
+      <w:pPr>
+        <w:widowControl/>
+        <w:spacing w:line="360" w:lineRule="auto"/>
+        <w:jc w:val="both"/>
+        <w:rPr>
+          <w:color w:val="333333"/>
+          <w:sz w:val="24"/>
+          <w:szCs w:val="24"/>
+        </w:rPr>
+      </w:pPr>
+      <w:r>
+        <w:rPr>
+          <w:color w:val="333333"/>
+          <w:sz w:val="24"/>
+          <w:szCs w:val="24"/>
+        </w:rPr>
+        <w:t xml:space="preserve">A diferenciação central do artefato — geração de saída portátil em vez de plataforma fechada — constitui a contribuição distintiva da pesquisa em relação aos sistemas mapeados, ainda que sua percepção pelos usuários reste por ser verificada na avaliação planejada. Os dados publicados pelo Comitê Gestor da Internet no Brasil (CGI.br, 2025) corroboram a relevância dessa abordagem: enquanto 70% dos estudantes brasileiros do ensino médio já utilizam IA generativa em pesquisas escolares, apenas cerca de um terço afirmam ter recebido orientação estruturada sobre como utilizá-las. Soluções que estruturam o uso da IA generativa, sem aprisionar o estudante em plataformas únicas, atendem demanda concreta identificada também no contexto universitário.</w:t>
       </w:r>
     </w:p>
     <w:p>
@@ -3683,27 +3215,27 @@
           <w:sz w:val="24"/>
           <w:szCs w:val="24"/>
         </w:rPr>
-        <w:t xml:space="preserve">Este trabalho apresentou o desenvolvimento e a avaliação de um sistema web destinado a transformar materiais acadêmicos brutos de estudantes universitários em um conjunto de artefatos portáteis — Markdown sintetizado organizado em estrutura hierárquica no Google Drive e system prompt personalizado — com o objetivo de viabilizar uso contextualizado de plataformas de inteligência artificial generativa.</w:t>
-      </w:r>
-    </w:p>
-    <w:p>
-      <w:pPr>
-        <w:widowControl/>
-        <w:spacing w:line="360" w:lineRule="auto"/>
-        <w:jc w:val="both"/>
-        <w:rPr>
-          <w:color w:val="333333"/>
-          <w:sz w:val="24"/>
-          <w:szCs w:val="24"/>
-        </w:rPr>
-      </w:pPr>
-      <w:r>
-        <w:rPr>
-          <w:color w:val="333333"/>
-          <w:sz w:val="24"/>
-          <w:szCs w:val="24"/>
-        </w:rPr>
-        <w:t xml:space="preserve">A pesquisa foi conduzida sob o método Design Science Research, aderente à natureza de projetos cujo output principal é um artefato (Hevner et al., 2004; Peffers et al., 2007; Dresch; Lacerda; Antunes Jr., 2015), e estruturada em quatro sprints conforme as seis atividades da DSRM. A validação técnica em 50 documentos-teste atingiu taxa de classificação correta de 87% e custo médio de US$ 0,013 por documento, superando os critérios de aceitação estabelecidos. A avaliação com 10 estudantes da UnB obteve pontuação SUS de 76,3, médias de 4,2 e 4,0 (em escala de cinco pontos) para Utilidade Percebida e Facilidade de Uso Percebida no questionário TAM e redução de 58% no tempo médio de organização de materiais em relação ao processo manual.</w:t>
+        <w:t xml:space="preserve">Este trabalho apresentou o desenvolvimento e o desenho da avaliação de um sistema web destinado a transformar materiais acadêmicos brutos de estudantes universitários em um conjunto de artefatos portáteis — Markdown sintetizado organizado em estrutura hierárquica no Google Drive e system prompt personalizado — com o objetivo de viabilizar uso contextualizado de plataformas de inteligência artificial generativa.</w:t>
+      </w:r>
+    </w:p>
+    <w:p>
+      <w:pPr>
+        <w:widowControl/>
+        <w:spacing w:line="360" w:lineRule="auto"/>
+        <w:jc w:val="both"/>
+        <w:rPr>
+          <w:color w:val="333333"/>
+          <w:sz w:val="24"/>
+          <w:szCs w:val="24"/>
+        </w:rPr>
+      </w:pPr>
+      <w:r>
+        <w:rPr>
+          <w:color w:val="333333"/>
+          <w:sz w:val="24"/>
+          <w:szCs w:val="24"/>
+        </w:rPr>
+        <w:t xml:space="preserve">A pesquisa foi conduzida sob o método Design Science Research, aderente à natureza de projetos cujo output principal é um artefato (Hevner et al., 2004; Peffers et al., 2007; Dresch; Lacerda; Antunes Jr., 2015), e estruturada em quatro sprints conforme as seis atividades da DSRM. O principal resultado alcançado foi o protótipo funcional, que implementa de ponta a ponta o pipeline de ingestão, classificação, síntese, compressão, validação e exportação, demonstrado em ambiente de desenvolvimento. As atividades de avaliação da DSRM — validação técnica em corpus controlado e avaliação com estudantes da UnB — foram integralmente desenhadas, com critérios de aceitação e instrumentos definidos, mas não foram executadas neste ciclo, uma vez que dependiam da disponibilização pública do sistema, ainda não concluída. Nenhum resultado empírico é, portanto, reportado.</w:t>
       </w:r>
     </w:p>
     <w:p>
@@ -3743,47 +3275,47 @@
           <w:sz w:val="24"/>
           <w:szCs w:val="24"/>
         </w:rPr>
-        <w:t xml:space="preserve">Reconhecem-se três limitações principais. Primeiro, a amostra de dez participantes, recrutada por conveniência em uma única instituição, confere caráter exploratório aos resultados e demanda estudos posteriores com amostragem ampliada para confirmação estatística. Segundo, o conjunto de 50 documentos-teste contempla os cinco formatos suportados, mas não esgota o universo de layouts e gêneros acadêmicos possíveis. Terceiro, o sistema depende de serviços externos (OpenRouter, Google Drive, Supabase), o que insere fatores de risco operacional não plenamente controláveis pela equipe de desenvolvimento.</w:t>
-      </w:r>
-    </w:p>
-    <w:p>
-      <w:pPr>
-        <w:widowControl/>
-        <w:spacing w:line="360" w:lineRule="auto"/>
-        <w:jc w:val="both"/>
-        <w:rPr>
-          <w:color w:val="333333"/>
-          <w:sz w:val="24"/>
-          <w:szCs w:val="24"/>
-        </w:rPr>
-      </w:pPr>
-      <w:r>
-        <w:rPr>
-          <w:color w:val="333333"/>
-          <w:sz w:val="24"/>
-          <w:szCs w:val="24"/>
-        </w:rPr>
-        <w:t xml:space="preserve">Como trabalhos futuros, propõem-se: a ampliação da avaliação para amostras superiores a cinquenta estudantes em diferentes instituições brasileiras, com foco em análise estatística inferencial; a integração nativa com o Sistema Integrado de Gestão de Atividades Acadêmicas (SIGAA) e plataformas equivalentes (Moodle, Canvas), eliminando a etapa de upload manual; a incorporação de Retrieval-Augmented Generation dinâmico, em que o system prompt gerado consulta os documentos processados em tempo de execução; a extensão da biblioteca de prompts oficiais com colaboração de professores das disciplinas; e a condução de estudo longitudinal acompanhando o desempenho acadêmico dos participantes ao longo de pelo menos dois semestres consecutivos.</w:t>
-      </w:r>
-    </w:p>
-    <w:p>
-      <w:pPr>
-        <w:widowControl/>
-        <w:spacing w:line="360" w:lineRule="auto"/>
-        <w:jc w:val="both"/>
-        <w:rPr>
-          <w:color w:val="333333"/>
-          <w:sz w:val="24"/>
-          <w:szCs w:val="24"/>
-        </w:rPr>
-      </w:pPr>
-      <w:r>
-        <w:rPr>
-          <w:color w:val="333333"/>
-          <w:sz w:val="24"/>
-          <w:szCs w:val="24"/>
-        </w:rPr>
-        <w:t xml:space="preserve">A automatização da preparação de contexto, posicionada entre os materiais acadêmicos brutos do estudante e a IA generativa de sua preferência, mostrou-se viável técnica e economicamente, com indícios positivos de utilidade percebida. O artefato resultante oferece base concreta para investigações futuras sobre o uso instrumentado de modelos de linguagem no ensino superior brasileiro.</w:t>
+        <w:t xml:space="preserve">Reconhecem-se as seguintes limitações principais. A primeira, e mais relevante, é a ausência de avaliação empírica: por não ter sido concluída a disponibilização pública do sistema na janela do projeto, a validação técnica e a avaliação com usuários não foram executadas, de modo que as evidências de desempenho, usabilidade e ganho de tempo permanecem por levantar. A segunda diz respeito ao desenho previsto da avaliação — amostra de dez participantes, por conveniência, em uma única instituição —, que confere caráter exploratório aos achados futuros e demandará amostragem ampliada para confirmação estatística. A terceira é a dependência de serviços externos (OpenRouter, Google Drive, Supabase), que insere fatores de risco operacional não plenamente controláveis pela equipe de desenvolvimento.</w:t>
+      </w:r>
+    </w:p>
+    <w:p>
+      <w:pPr>
+        <w:widowControl/>
+        <w:spacing w:line="360" w:lineRule="auto"/>
+        <w:jc w:val="both"/>
+        <w:rPr>
+          <w:color w:val="333333"/>
+          <w:sz w:val="24"/>
+          <w:szCs w:val="24"/>
+        </w:rPr>
+      </w:pPr>
+      <w:r>
+        <w:rPr>
+          <w:color w:val="333333"/>
+          <w:sz w:val="24"/>
+          <w:szCs w:val="24"/>
+        </w:rPr>
+        <w:t xml:space="preserve">Como trabalhos futuros, propõem-se, em ordem de prioridade: a conclusão da implantação pública do sistema e a execução da avaliação já desenhada — validação técnica em corpus controlado e aplicação dos instrumentos SUS, TAM, comparativo cronometrado e entrevistas com os dez participantes previstos; a ampliação subsequente da avaliação para amostras superiores a cinquenta estudantes em diferentes instituições brasileiras, com foco em análise estatística inferencial; a integração nativa com o Sistema Integrado de Gestão de Atividades Acadêmicas (SIGAA) e plataformas equivalentes (Moodle, Canvas), eliminando a etapa de upload manual; a incorporação de Retrieval-Augmented Generation dinâmico, em que o system prompt gerado consulta os documentos processados em tempo de execução; a extensão da biblioteca de prompts oficiais com colaboração de professores das disciplinas; e a condução de estudo longitudinal acompanhando o desempenho acadêmico dos participantes ao longo de pelo menos dois semestres consecutivos.</w:t>
+      </w:r>
+    </w:p>
+    <w:p>
+      <w:pPr>
+        <w:widowControl/>
+        <w:spacing w:line="360" w:lineRule="auto"/>
+        <w:jc w:val="both"/>
+        <w:rPr>
+          <w:color w:val="333333"/>
+          <w:sz w:val="24"/>
+          <w:szCs w:val="24"/>
+        </w:rPr>
+      </w:pPr>
+      <w:r>
+        <w:rPr>
+          <w:color w:val="333333"/>
+          <w:sz w:val="24"/>
+          <w:szCs w:val="24"/>
+        </w:rPr>
+        <w:t xml:space="preserve">A automatização da preparação de contexto, posicionada entre os materiais acadêmicos brutos do estudante e a IA generativa de sua preferência, mostrou-se viável do ponto de vista de engenharia, materializada em um protótipo funcional completo. A confirmação de sua utilidade e eficiência junto aos estudantes depende da avaliação empírica ora planejada. Ainda assim, o artefato resultante oferece base concreta para investigações futuras sobre o uso instrumentado de modelos de linguagem no ensino superior brasileiro.</w:t>
       </w:r>
     </w:p>
     <w:p>

</xml_diff>